<commit_message>
Limit this procedure's instrument requirements to numbering.
Equipment keeps classification and lifecycle controls. Instruments receive a unique number only; their classification, calibration, use, and maintenance stay in the applicable instrument procedures.

Co-authored-by: lyan29832 <lyan29832@gmail.com>
</commit_message>
<xml_diff>
--- a/生产设备与仪器分类、编号管理规程.docx
+++ b/生产设备与仪器分类、编号管理规程.docx
@@ -15,7 +15,7 @@
           <w:i w:val="0"/>
           <w:sz w:val="32"/>
         </w:rPr>
-        <w:t>生产设备与仪器分类、编号管理规程</w:t>
+        <w:t>生产设备分类与编号管理规程</w:t>
       </w:r>
     </w:p>
     <w:p>
@@ -187,7 +187,7 @@
                 <w:i w:val="0"/>
                 <w:sz w:val="21"/>
               </w:rPr>
-              <w:t>生产设备与仪器分类、编号管理规程</w:t>
+              <w:t>生产设备分类与编号管理规程</w:t>
             </w:r>
           </w:p>
         </w:tc>
@@ -677,7 +677,7 @@
           <w:i w:val="0"/>
           <w:sz w:val="24"/>
         </w:rPr>
-        <w:t>1.1  本规程规定生产设备与仪器的分类原则、分类后的管理要求以及唯一编号规则，使纳入管理的每台设备、仪器具有确定的管理类别和公司内唯一的编号，以便识别、使用、维护、确认和追溯。</w:t>
+        <w:t>1.1  本规程规定生产设备的分类原则、分类后的管理要求和唯一编号规则，并规定仪器的编号规则。仪器只按本规程编号，不按本规程分类，也不按本规程实施使用、维护、确认和校准管理。</w:t>
       </w:r>
     </w:p>
     <w:p>
@@ -709,7 +709,7 @@
           <w:i w:val="0"/>
           <w:sz w:val="24"/>
         </w:rPr>
-        <w:t>2.1  本规程适用于公司生产设备、独立辅助设备、配电及电力设备、办公及其他设备的分类和编号，以及检测仪器的编号。</w:t>
+        <w:t>2.1  本规程的设备分类和第6.3款管理要求，适用于公司生产设备、独立辅助设备、配电及电力设备和办公及其他设备。这些设备同时适用本规程的编号规则。</w:t>
       </w:r>
     </w:p>
     <w:p>
@@ -725,7 +725,7 @@
           <w:i w:val="0"/>
           <w:sz w:val="24"/>
         </w:rPr>
-        <w:t>2.2  质量控制部仪器的分类、校准和检验使用管理执行 SMP-QC-000-021《检验仪器管理规程》。该类仪器的编号执行本规程，并登记在公司设备台账中。</w:t>
+        <w:t>2.2  仪器只适用本规程第6.4款至第6.8款的编号规则，包括编号结构、代号、配号、变更、注销，以及台账中的编号信息。仪器的分类、校准、使用、维护和记录执行其适用的管理规程。</w:t>
       </w:r>
     </w:p>
     <w:p>
@@ -741,7 +741,23 @@
           <w:i w:val="0"/>
           <w:sz w:val="24"/>
         </w:rPr>
-        <w:t>2.3  系统影响性评估和组件关键性评估的方法与结论判定执行 SMP-QA-000-037《系统影响性评估及组件关键性评估管理规程》。本规程根据该评估结论确定 A 类或 B 类管理要求。</w:t>
+        <w:t>2.3  质量控制部仪器的分类、校准和检验使用管理执行 SMP-QC-000-021《检验仪器管理规程》。该类仪器的编号执行本规程，并登记在公司设备台账中。</w:t>
+      </w:r>
+    </w:p>
+    <w:p>
+      <w:pPr>
+        <w:spacing w:before="0" w:after="60" w:lineRule="auto" w:line="240"/>
+        <w:ind w:firstLine="0" w:left="0"/>
+        <w:jc w:val="both"/>
+      </w:pPr>
+      <w:r>
+        <w:rPr>
+          <w:rFonts w:ascii="宋体" w:hAnsi="宋体" w:eastAsia="宋体" w:cs="宋体"/>
+          <w:b w:val="0"/>
+          <w:i w:val="0"/>
+          <w:sz w:val="24"/>
+        </w:rPr>
+        <w:t>2.4  设备的系统影响性评估和组件关键性评估执行 SMP-QA-000-037《系统影响性评估及组件关键性评估管理规程》。本规程根据该评估结论确定设备的 A 类或 B 类管理要求。</w:t>
       </w:r>
     </w:p>
     <w:p>
@@ -773,7 +789,7 @@
           <w:i w:val="0"/>
           <w:sz w:val="24"/>
         </w:rPr>
-        <w:t>3.1  设备工程部负责人与 QA 监督本规程的实施。发现编号重复、管理类别与评估结论不一致，或现场标识与设备台账不一致时，应当督促责任部门纠正。</w:t>
+        <w:t>3.1  设备工程部负责人与 QA 监督本规程的实施。发现编号重复、设备管理类别与评估结论不一致，或现场标识与设备台账不一致时，应当督促责任部门纠正。</w:t>
       </w:r>
     </w:p>
     <w:p>
@@ -821,7 +837,7 @@
           <w:i w:val="0"/>
           <w:sz w:val="24"/>
         </w:rPr>
-        <w:t>3.4  质量控制部提供本部门仪器的名称、安装地点和编号所需信息，并使现场仪器编号与设备台账一致。质量控制部仪器的管理类别按 SMP-QC-000-021 确定。</w:t>
+        <w:t>3.4  仪器所在部门提供仪器名称、型号、出厂编号、安装地点和编号所需的大类、部门信息，并使现场仪器编号与设备台账一致。仪器的分类、校准和使用管理不由本规程规定。质量控制部仪器的上述管理执行 SMP-QC-000-021。</w:t>
       </w:r>
     </w:p>
     <w:p>
@@ -837,7 +853,7 @@
           <w:i w:val="0"/>
           <w:sz w:val="24"/>
         </w:rPr>
-        <w:t>3.5  设备、仪器的使用人员按现场编号和状态标识使用设备，并如实填写使用日志及其他适用记录。</w:t>
+        <w:t>3.5  设备使用人员按现场编号和状态标识使用设备，并如实填写使用日志及其他适用记录。仪器使用人员使用本规程配发的编号；仪器的使用和记录执行其适用规程。</w:t>
       </w:r>
     </w:p>
     <w:p>
@@ -869,7 +885,7 @@
           <w:i w:val="0"/>
           <w:sz w:val="24"/>
         </w:rPr>
-        <w:t>4.1  《药品生产质量管理规范（2010年修订）》（卫生部令第79号）第七十一条、第七十二条、第七十三条、第七十九条、第八十条、第八十一条、第八十二条、第八十三条、第八十六条、第八十七条、第八十八条、第九十条、第九十一条、第九十三条和第九十四条。</w:t>
+        <w:t>4.1  《药品生产质量管理规范（2010年修订）》（卫生部令第79号）第七十一条、第七十二条、第七十三条、第七十九条、第八十条、第八十一条、第八十二条、第八十三条、第八十六条、第八十七条和第八十八条。上述条款在本规程中用于设备。仪器的校准和使用管理执行其适用规程。</w:t>
       </w:r>
     </w:p>
     <w:p>
@@ -1102,7 +1118,7 @@
                 <w:i w:val="0"/>
                 <w:sz w:val="21"/>
               </w:rPr>
-              <w:t>确定直接影响系统、非直接影响系统及组件关键性</w:t>
+              <w:t>确定设备的直接影响系统、非直接影响系统及组件关键性</w:t>
             </w:r>
           </w:p>
         </w:tc>
@@ -1577,7 +1593,7 @@
                 <w:i w:val="0"/>
                 <w:sz w:val="21"/>
               </w:rPr>
-              <w:t>质量控制部仪器的分类、校准和检验使用管理</w:t>
+              <w:t>质量控制部仪器的分类、校准和检验使用管理；本规程只为其配号</w:t>
             </w:r>
           </w:p>
         </w:tc>
@@ -1772,7 +1788,7 @@
           <w:i w:val="0"/>
           <w:sz w:val="24"/>
         </w:rPr>
-        <w:t>5.10  设备台账：登记设备、仪器现行编号、管理类别、位置和状态的受控清单。经批准的纸质台账与电子台账均用于追溯。</w:t>
+        <w:t>5.10  设备台账：登记设备的现行编号、管理类别、位置和状态，以及仪器现行编号的受控清单。经批准的纸质台账与电子台账均用于追溯。</w:t>
       </w:r>
     </w:p>
     <w:p>
@@ -1788,7 +1804,7 @@
           <w:i w:val="0"/>
           <w:sz w:val="24"/>
         </w:rPr>
-        <w:t>5.11  使用日志：用于药品生产或检验的设备和仪器的记录，内容包括使用、清洁、维护和维修情况以及日期、时间、所生产及检验的药品名称、规格和批号等。本规程所称使用记录与使用日志为同一类记录。</w:t>
+        <w:t>5.11  使用日志：用于药品生产的设备记录，内容包括使用、清洁、维护和维修情况以及日期、时间、所生产药品的名称、规格和批号等。本规程所称使用记录与使用日志为同一类记录。仪器的使用和校准记录不由本规程规定。</w:t>
       </w:r>
     </w:p>
     <w:p>
@@ -1804,7 +1820,23 @@
           <w:i w:val="0"/>
           <w:sz w:val="24"/>
         </w:rPr>
-        <w:t>5.12  SMP-QA-000-037 对直接影响系统、非直接影响系统另有书面定义时，评估活动以该规程的定义为准。本规程第5.2款和第5.3款用于把评估结论对应到 A 类、B 类。</w:t>
+        <w:t>5.12  仪器：本规程中需要编号的检测、测量或记录器具，大类代号为 J。仪器只执行编号规则。</w:t>
+      </w:r>
+    </w:p>
+    <w:p>
+      <w:pPr>
+        <w:spacing w:before="0" w:after="60" w:lineRule="auto" w:line="240"/>
+        <w:ind w:firstLine="0" w:left="0"/>
+        <w:jc w:val="both"/>
+      </w:pPr>
+      <w:r>
+        <w:rPr>
+          <w:rFonts w:ascii="宋体" w:hAnsi="宋体" w:eastAsia="宋体" w:cs="宋体"/>
+          <w:b w:val="0"/>
+          <w:i w:val="0"/>
+          <w:sz w:val="24"/>
+        </w:rPr>
+        <w:t>5.13  SMP-QA-000-037 对直接影响系统、非直接影响系统另有书面定义时，设备评估活动以该规程的定义为准。本规程第5.2款和第5.3款用于把设备的评估结论对应到 A 类、B 类。</w:t>
       </w:r>
     </w:p>
     <w:p>
@@ -1852,7 +1884,7 @@
           <w:i w:val="0"/>
           <w:sz w:val="24"/>
         </w:rPr>
-        <w:t>6.1.1  管理类别表示系统对产品质量的影响。编号表示设备身份。二者同时登记在设备台账中。大类代号不代替 A 类或 B 类，A 类或 B 类不代替设备编号。</w:t>
+        <w:t>6.1.1  管理类别表示设备所属系统对产品质量的影响，只用于设备。编号表示设备或仪器的身份。设备的类别和编号同时登记在设备台账中。大类代号不代替 A 类或 B 类，A 类或 B 类不代替设备编号。</w:t>
       </w:r>
     </w:p>
     <w:p>
@@ -1884,7 +1916,23 @@
           <w:i w:val="0"/>
           <w:sz w:val="24"/>
         </w:rPr>
-        <w:t>6.1.3  编号在该设备存续期间保持稳定。设备报废、调出，或经变更控制批准重新编号后，原编号冻结，不再授予其他设备。历史记录继续沿用记录形成时的编号。</w:t>
+        <w:t>6.1.3  编号在该设备或仪器存续期间保持稳定。设备或仪器报废、调出，或经变更控制批准重新编号后，原编号冻结，不再授予其他设备或仪器。历史记录继续沿用记录形成时的编号。</w:t>
+      </w:r>
+    </w:p>
+    <w:p>
+      <w:pPr>
+        <w:spacing w:before="0" w:after="60" w:lineRule="auto" w:line="240"/>
+        <w:ind w:firstLine="0" w:left="0"/>
+        <w:jc w:val="both"/>
+      </w:pPr>
+      <w:r>
+        <w:rPr>
+          <w:rFonts w:ascii="宋体" w:hAnsi="宋体" w:eastAsia="宋体" w:cs="宋体"/>
+          <w:b w:val="0"/>
+          <w:i w:val="0"/>
+          <w:sz w:val="24"/>
+        </w:rPr>
+        <w:t>6.1.4  仪器不划分 A 类或 B 类，不填写本规程的管理类别，只领取并使用编号。</w:t>
       </w:r>
     </w:p>
     <w:p>
@@ -1916,7 +1964,7 @@
           <w:i w:val="0"/>
           <w:sz w:val="24"/>
         </w:rPr>
-        <w:t>6.2.1  设备投入使用前，归属部门按 SMP-QA-000-037 完成系统影响性评估。组件关键性评估按该规程执行，其结论用于确认、维护和校准范围的确定。本规程不另设组件分级。</w:t>
+        <w:t>6.2.1  本节只适用于设备。设备投入使用前，归属部门按 SMP-QA-000-037 完成系统影响性评估。组件关键性评估按该规程执行，其结论用于设备确认和维护范围的确定。本规程不另设组件分级。</w:t>
       </w:r>
     </w:p>
     <w:p>
@@ -2311,7 +2359,7 @@
           <w:i w:val="0"/>
           <w:sz w:val="24"/>
         </w:rPr>
-        <w:t>6.2.6  本规程不规定质量控制部仪器的管理类别。</w:t>
+        <w:t>6.2.6  仪器不按本节分类。质量控制部仪器的分类执行 SMP-QC-000-021。其他仪器的分类执行其适用的管理规程。</w:t>
       </w:r>
     </w:p>
     <w:p>
@@ -2343,7 +2391,7 @@
           <w:i w:val="0"/>
           <w:sz w:val="24"/>
         </w:rPr>
-        <w:t>6.3.1  归属部门在设备投入使用前完成与其管理类别相适应的规程批准，并对操作人员和维护人员进行培训。培训合格后，人员方可独立操作或维护该设备。</w:t>
+        <w:t>6.3.1  本节只适用于设备。仪器不执行本节，只执行第6.4款至第6.8款。</w:t>
       </w:r>
     </w:p>
     <w:p>
@@ -2359,7 +2407,7 @@
           <w:i w:val="0"/>
           <w:sz w:val="24"/>
         </w:rPr>
-        <w:t>6.3.2  用于药品生产或检验的设备和仪器应当建立使用日志。使用日志至少包括使用、清洁、维护和维修情况以及日期、时间、所生产及检验的药品名称、规格和批号等。直接用于某一批产品生产或检验的设备，使用日志应当记录该药品的名称、规格和批号。多个批次共用的公用系统，使用日志应当记录运行、清洁、维护、维修以及日期和时间，并使批记录能够追溯到该系统相应时间的运行记录。</w:t>
+        <w:t>6.3.2  归属部门在设备投入使用前完成与其管理类别相适应的规程批准，并对操作人员和维护人员进行培训。培训合格后，人员方可独立操作或维护该设备。</w:t>
       </w:r>
     </w:p>
     <w:p>
@@ -2375,7 +2423,7 @@
           <w:i w:val="0"/>
           <w:sz w:val="24"/>
         </w:rPr>
-        <w:t>6.3.3  不用于药品生产或检验的 B 类设备，由归属部门保存与其实际使用、清洁和维护相适应的记录。</w:t>
+        <w:t>6.3.3  用于药品生产的设备应当建立使用日志。使用日志至少包括使用、清洁、维护和维修情况以及日期、时间、所生产药品的名称、规格和批号等。直接用于某一批产品生产的设备，使用日志应当记录该药品的名称、规格和批号。多个批次共用的公用系统，使用日志应当记录运行、清洁、维护、维修以及日期和时间，并使批记录能够追溯到该系统相应时间的运行记录。</w:t>
       </w:r>
     </w:p>
     <w:p>
@@ -2391,7 +2439,7 @@
           <w:i w:val="0"/>
           <w:sz w:val="24"/>
         </w:rPr>
-        <w:t>6.3.4  生产设备的状态标识应当标明设备编号。有内容物时，还应当标明内容物的名称、规格和批号；无内容物时，应当标明清洁状态。不合格设备在移出生产区或质量控制区之前，应当有醒目的状态标识。</w:t>
+        <w:t>6.3.4  不用于药品生产的 B 类设备，由归属部门保存与其实际使用、清洁和维护相适应的记录。</w:t>
       </w:r>
     </w:p>
     <w:p>
@@ -2407,7 +2455,7 @@
           <w:i w:val="0"/>
           <w:sz w:val="24"/>
         </w:rPr>
-        <w:t>6.3.5  A 类设备由归属部门分别组织操作规程、清洁规程和维护规程的起草、修订和审核，并对相关人员进行培训。A 类设备建立第6.3.2款规定的使用日志，如实记录设备运行情况。</w:t>
+        <w:t>6.3.5  生产设备的状态标识应当标明设备编号。有内容物时，还应当标明内容物的名称、规格和批号；无内容物时，应当标明清洁状态。不合格设备在移出生产区或质量控制区之前，应当有醒目的状态标识。</w:t>
       </w:r>
     </w:p>
     <w:p>
@@ -2423,7 +2471,7 @@
           <w:i w:val="0"/>
           <w:sz w:val="24"/>
         </w:rPr>
-        <w:t>6.3.6  A 类设备由归属部门指定设备负责人。设备负责人离职或调岗时，应当与继任者完成交接。交接内容至少包括使用日志、维护保养记录、操作规程、维护规程、清洁规程、备品备件、设备运行情况及注意事项。交接记录由双方签署姓名和日期，并纳入设备档案。</w:t>
+        <w:t>6.3.6  A 类设备由归属部门分别组织操作规程、清洁规程和维护规程的起草、修订和审核，并对相关人员进行培训。A 类设备建立第6.3.3款规定的使用日志，如实记录设备运行情况。</w:t>
       </w:r>
     </w:p>
     <w:p>
@@ -2439,7 +2487,7 @@
           <w:i w:val="0"/>
           <w:sz w:val="24"/>
         </w:rPr>
-        <w:t>6.3.7  B 类设备由归属部门根据设备的结构复杂程度和设备说明书，组织操作规程、清洁规程和维护规程的起草、修订和审核。操作人员和维护人员经培训合格后方可上岗。</w:t>
+        <w:t>6.3.7  A 类设备由归属部门指定设备负责人。设备负责人离职或调岗时，应当与继任者完成交接。交接内容至少包括使用日志、维护保养记录、操作规程、维护规程、清洁规程、备品备件、设备运行情况及注意事项。交接记录由双方签署姓名和日期，并纳入设备档案。</w:t>
       </w:r>
     </w:p>
     <w:p>
@@ -2455,7 +2503,7 @@
           <w:i w:val="0"/>
           <w:sz w:val="24"/>
         </w:rPr>
-        <w:t>6.3.8  结构简单、操作和维护要求明确的 B 类设备，可以将操作规程、清洁规程和维护规程合并为一份《操作维护清洁规程》。合并后的规程应当完整、清晰、可执行，并包含使用、清洁和维护要求。</w:t>
+        <w:t>6.3.8  B 类设备由归属部门根据设备的结构复杂程度和设备说明书，组织操作规程、清洁规程和维护规程的起草、修订和审核。操作人员和维护人员经培训合格后方可上岗。</w:t>
       </w:r>
     </w:p>
     <w:p>
@@ -2471,7 +2519,7 @@
           <w:i w:val="0"/>
           <w:sz w:val="24"/>
         </w:rPr>
-        <w:t>6.3.9  设备确认的对象、方案和实施执行 SMP-VP-000-004。系统影响性评估结论作为确定确认范围的输入。已完成确认的生产设备，应当在确认的参数范围内使用。设备经改造或重大维修后，应当完成再确认并符合要求，方可恢复用于生产。</w:t>
+        <w:t>6.3.9  结构简单、操作和维护要求明确的 B 类设备，可以将操作规程、清洁规程和维护规程合并为一份《操作维护清洁规程》。合并后的规程应当完整、清晰、可执行，并包含使用、清洁和维护要求。</w:t>
       </w:r>
     </w:p>
     <w:p>
@@ -2487,7 +2535,7 @@
           <w:i w:val="0"/>
           <w:sz w:val="24"/>
         </w:rPr>
-        <w:t>6.3.10  预防性维护执行 SMP-EQ-100-003。故障报告与维修执行 SMP-EQ-100-004。维护和维修记录使用本规程规定的设备编号。</w:t>
+        <w:t>6.3.10  设备确认的对象、方案和实施执行 SMP-VP-000-004。系统影响性评估结论作为确定确认范围的输入。已完成确认的生产设备，应当在确认的参数范围内使用。设备经改造或重大维修后，应当完成再确认并符合要求，方可恢复用于生产。</w:t>
       </w:r>
     </w:p>
     <w:p>
@@ -2503,7 +2551,7 @@
           <w:i w:val="0"/>
           <w:sz w:val="24"/>
         </w:rPr>
-        <w:t>6.3.11  本规程不规定校准周期。生产和检验用衡器、量具、仪表、记录和控制设备以及仪器，按其已批准的校准规程校准；质量控制部仪器同时执行 SMP-QC-000-021。校准记录和校准标识使用本规程规定的设备编号，校准标识标明校准有效期。未经校准、超过校准有效期或已失准的，停止用于生产或检验。</w:t>
+        <w:t>6.3.11  预防性维护执行 SMP-EQ-100-003。故障报告与维修执行 SMP-EQ-100-004。设备的维护和维修记录使用本规程规定的设备编号。</w:t>
       </w:r>
     </w:p>
     <w:p>
@@ -4026,7 +4074,7 @@
           <w:i w:val="0"/>
           <w:sz w:val="24"/>
         </w:rPr>
-        <w:t>6.6.1  归属部门在设备建账时，应当向设备工程部提供设备名称、型号、出厂编号、使用地点、建议的大类代号和部门代号，以及系统影响性评估结论或评估编号。附属装置同时提供主设备的现行编号。质量控制部仪器提供仪器名称和安装地点。</w:t>
+        <w:t>6.6.1  设备归属部门在设备建账时，应当向设备工程部提供设备名称、型号、出厂编号、使用地点、建议的大类代号和部门代号，以及系统影响性评估结论或评估编号。附属装置同时提供主设备的现行编号。仪器所在部门只提供仪器名称、型号、出厂编号、安装地点和建议的大类代号、部门代号，不提供 A 类或 B 类结论。</w:t>
       </w:r>
     </w:p>
     <w:p>
@@ -4058,7 +4106,7 @@
           <w:i w:val="0"/>
           <w:sz w:val="24"/>
         </w:rPr>
-        <w:t>6.6.3  现场标识、使用日志、维护维修记录、确认记录和校准记录应当使用该设备的现行编号。</w:t>
+        <w:t>6.6.3  设备的现场标识、使用日志、维护维修记录和确认记录应当使用该设备的现行编号。仪器的现场编号使用本规程配发的编号。仪器的使用、校准和维护记录执行其适用规程，并引用同一编号。</w:t>
       </w:r>
     </w:p>
     <w:p>
@@ -4106,7 +4154,7 @@
           <w:i w:val="0"/>
           <w:sz w:val="24"/>
         </w:rPr>
-        <w:t>6.6.6  设备报废、调出或不再纳入本公司管理时，设备工程部在台账中注销其在用状态，并按第6.1.3款冻结编号。</w:t>
+        <w:t>6.6.6  设备或仪器报废、调出或不再纳入本公司管理时，设备工程部在台账中注销其在用状态，并按第6.1.3款冻结编号。</w:t>
       </w:r>
     </w:p>
     <w:p>
@@ -4154,7 +4202,7 @@
           <w:i w:val="0"/>
           <w:sz w:val="24"/>
         </w:rPr>
-        <w:t>6.7.1  设备工程部在设备台账中登记现行编号，并使台账至少能够追溯下列信息：曾用编号、设备名称、型号、出厂编号、归属部门、安装地点、大类代号、管理类别、系统影响性评估编号、主设备编号（仅附属装置填写）、状态和启用日期。</w:t>
+        <w:t>6.7.1  设备工程部在设备台账中登记设备的现行编号，并使设备条目至少能够追溯下列信息：曾用编号、设备名称、型号、出厂编号、归属部门、安装地点、大类代号、管理类别、系统影响性评估编号、主设备编号（仅附属装置填写）、状态和启用日期。</w:t>
       </w:r>
     </w:p>
     <w:p>
@@ -4170,7 +4218,7 @@
           <w:i w:val="0"/>
           <w:sz w:val="24"/>
         </w:rPr>
-        <w:t>6.7.2  质量控制部仪器与生产设备使用同一套编号体系。质量控制部可以维护本部门仪器清单，仪器清单中的编号与公司设备台账一致。</w:t>
+        <w:t>6.7.2  仪器与设备使用同一套编号体系，并登记在同一设备台账中。仪器条目登记编号、名称、型号、出厂编号、所在部门、安装地点、大类代号、状态和启用日期。仪器条目不按本规程填写管理类别和系统影响性评估编号。仪器所在部门可以另维护仪器清单，清单中的编号与设备台账一致。</w:t>
       </w:r>
     </w:p>
     <w:p>
@@ -4235,6 +4283,22 @@
           <w:sz w:val="24"/>
         </w:rPr>
         <w:t>6.8.3  401 车间的一台压片机，假设一级编号为 S2C080。固定服务于该压片机的第 1 台吸尘器属于附属装置，二级编号为 S2C080-01。该吸尘器不再另编大类 F 的一级编号。</w:t>
+      </w:r>
+    </w:p>
+    <w:p>
+      <w:pPr>
+        <w:spacing w:before="0" w:after="60" w:lineRule="auto" w:line="240"/>
+        <w:ind w:firstLine="0" w:left="0"/>
+        <w:jc w:val="both"/>
+      </w:pPr>
+      <w:r>
+        <w:rPr>
+          <w:rFonts w:ascii="宋体" w:hAnsi="宋体" w:eastAsia="宋体" w:cs="宋体"/>
+          <w:b w:val="0"/>
+          <w:i w:val="0"/>
+          <w:sz w:val="24"/>
+        </w:rPr>
+        <w:t>6.8.4  质量控制部的一台检测仪器，假设流水号为 001。其编号为 JE001。其中 J 为检测仪器，E 为质量控制部，001 为流水号。该仪器只取得编号，不登记 A 类或 B 类。</w:t>
       </w:r>
     </w:p>
     <w:p>
@@ -5039,7 +5103,7 @@
           <w:i w:val="0"/>
           <w:sz w:val="24"/>
         </w:rPr>
-        <w:t>7.1  确定管理类别时，以该设备的系统影响性评估结论为准，并以表2帮助理解 A 类、B 类所对应的结论。</w:t>
+        <w:t>7.1  确定设备管理类别时，以该设备的系统影响性评估结论为准，并以表2帮助理解 A 类、B 类所对应的结论。仪器不按表2分类。</w:t>
       </w:r>
     </w:p>
     <w:p>
@@ -5103,7 +5167,7 @@
           <w:i w:val="0"/>
           <w:sz w:val="24"/>
         </w:rPr>
-        <w:t>7.5  质量控制部仪器同时涉及本规程和 SMP-QC-000-021 时，管理类别、校准和检验使用管理执行 SMP-QC-000-021，编号的结构和唯一性执行本规程。</w:t>
+        <w:t>7.5  仪器只执行本规程的编号。质量控制部仪器的分类、校准和检验使用管理执行 SMP-QC-000-021。其他仪器的分类、校准、使用和维护执行其适用规程。</w:t>
       </w:r>
     </w:p>
     <w:p>
@@ -5215,7 +5279,7 @@
           <w:i w:val="0"/>
           <w:sz w:val="24"/>
         </w:rPr>
-        <w:t>9.1.2  A 类设备负责人交接记录纳入设备档案。公司已有交接单的，使用该交接单。尚未指定表单的，由文件管理部门指定记录表后实施第6.3.6款的交接记录。</w:t>
+        <w:t>9.1.2  A 类设备负责人交接记录纳入设备档案。公司已有交接单的，使用该交接单。尚未指定表单的，由文件管理部门指定记录表后实施第6.3.7款的交接记录。</w:t>
       </w:r>
     </w:p>
     <w:p>
@@ -5263,7 +5327,7 @@
           <w:i w:val="0"/>
           <w:sz w:val="24"/>
         </w:rPr>
-        <w:t>9.2.2  使用日志、维护维修记录、确认记录、校准记录、培训记录和变更记录，分别按各自的受控规程保存。这些记录中的设备编号与设备台账的现行编号一致；变更前的记录保留当时的编号。</w:t>
+        <w:t>9.2.2  设备的使用日志、维护维修记录、确认记录、培训记录和变更记录，分别按各自的受控规程保存，其中的设备编号与设备台账的现行编号一致。仪器的使用、校准和维护记录按其适用规程保存，并引用本规程配发的编号。变更前的记录保留当时的编号。</w:t>
       </w:r>
     </w:p>
     <w:sectPr>
@@ -5356,7 +5420,7 @@
         <w:i w:val="0"/>
         <w:sz w:val="18"/>
       </w:rPr>
-      <w:t>生产设备与仪器分类、编号管理规程</w:t>
+      <w:t>生产设备分类与编号管理规程</w:t>
     </w:r>
   </w:p>
 </w:hdr>

</xml_diff>

<commit_message>
Restore the equipment procedure to the original requirements.
Reorganize classification, class-based controls, and numbering for clarity, and remove controls that were not in the source text.

Co-authored-by: lyan29832 <lyan29832@gmail.com>
</commit_message>
<xml_diff>
--- a/生产设备与仪器分类、编号管理规程.docx
+++ b/生产设备与仪器分类、编号管理规程.docx
@@ -417,136 +417,6 @@
                 <w:i w:val="0"/>
                 <w:sz w:val="21"/>
               </w:rPr>
-              <w:t>审核</w:t>
-            </w:r>
-          </w:p>
-        </w:tc>
-        <w:tc>
-          <w:tcPr>
-            <w:tcW w:type="dxa" w:w="6974"/>
-            <w:tcBorders>
-              <w:top w:val="single" w:sz="4" w:space="0" w:color="000000"/>
-              <w:left w:val="single" w:sz="4" w:space="0" w:color="000000"/>
-              <w:bottom w:val="single" w:sz="4" w:space="0" w:color="000000"/>
-              <w:right w:val="single" w:sz="4" w:space="0" w:color="000000"/>
-            </w:tcBorders>
-            <w:shd w:val="clear" w:color="auto" w:fill="FFFFFF"/>
-            <w:vAlign w:val="center"/>
-          </w:tcPr>
-          <w:p>
-            <w:pPr>
-              <w:spacing w:before="20" w:after="20" w:lineRule="auto" w:line="216"/>
-              <w:ind w:firstLine="0" w:left="0"/>
-              <w:jc w:val="left"/>
-            </w:pPr>
-            <w:r/>
-            <w:r>
-              <w:rPr>
-                <w:rFonts w:ascii="宋体" w:hAnsi="宋体" w:eastAsia="宋体" w:cs="宋体"/>
-                <w:b w:val="0"/>
-                <w:i w:val="0"/>
-                <w:sz w:val="21"/>
-              </w:rPr>
-              <w:t>按文件批准权限填写</w:t>
-            </w:r>
-          </w:p>
-        </w:tc>
-      </w:tr>
-      <w:tr>
-        <w:trPr>
-          <w:cantSplit/>
-        </w:trPr>
-        <w:tc>
-          <w:tcPr>
-            <w:tcW w:type="dxa" w:w="2041"/>
-            <w:tcBorders>
-              <w:top w:val="single" w:sz="4" w:space="0" w:color="000000"/>
-              <w:left w:val="single" w:sz="4" w:space="0" w:color="000000"/>
-              <w:bottom w:val="single" w:sz="4" w:space="0" w:color="000000"/>
-              <w:right w:val="single" w:sz="4" w:space="0" w:color="000000"/>
-            </w:tcBorders>
-            <w:shd w:val="clear" w:color="auto" w:fill="FFFFFF"/>
-            <w:vAlign w:val="center"/>
-          </w:tcPr>
-          <w:p>
-            <w:pPr>
-              <w:spacing w:before="20" w:after="20" w:lineRule="auto" w:line="216"/>
-              <w:ind w:firstLine="0" w:left="0"/>
-              <w:jc w:val="left"/>
-            </w:pPr>
-            <w:r/>
-            <w:r>
-              <w:rPr>
-                <w:rFonts w:ascii="宋体" w:hAnsi="宋体" w:eastAsia="宋体" w:cs="宋体"/>
-                <w:b w:val="0"/>
-                <w:i w:val="0"/>
-                <w:sz w:val="21"/>
-              </w:rPr>
-              <w:t>批准</w:t>
-            </w:r>
-          </w:p>
-        </w:tc>
-        <w:tc>
-          <w:tcPr>
-            <w:tcW w:type="dxa" w:w="6974"/>
-            <w:tcBorders>
-              <w:top w:val="single" w:sz="4" w:space="0" w:color="000000"/>
-              <w:left w:val="single" w:sz="4" w:space="0" w:color="000000"/>
-              <w:bottom w:val="single" w:sz="4" w:space="0" w:color="000000"/>
-              <w:right w:val="single" w:sz="4" w:space="0" w:color="000000"/>
-            </w:tcBorders>
-            <w:shd w:val="clear" w:color="auto" w:fill="FFFFFF"/>
-            <w:vAlign w:val="center"/>
-          </w:tcPr>
-          <w:p>
-            <w:pPr>
-              <w:spacing w:before="20" w:after="20" w:lineRule="auto" w:line="216"/>
-              <w:ind w:firstLine="0" w:left="0"/>
-              <w:jc w:val="left"/>
-            </w:pPr>
-            <w:r/>
-            <w:r>
-              <w:rPr>
-                <w:rFonts w:ascii="宋体" w:hAnsi="宋体" w:eastAsia="宋体" w:cs="宋体"/>
-                <w:b w:val="0"/>
-                <w:i w:val="0"/>
-                <w:sz w:val="21"/>
-              </w:rPr>
-              <w:t>按文件批准权限填写</w:t>
-            </w:r>
-          </w:p>
-        </w:tc>
-      </w:tr>
-      <w:tr>
-        <w:trPr>
-          <w:cantSplit/>
-        </w:trPr>
-        <w:tc>
-          <w:tcPr>
-            <w:tcW w:type="dxa" w:w="2041"/>
-            <w:tcBorders>
-              <w:top w:val="single" w:sz="4" w:space="0" w:color="000000"/>
-              <w:left w:val="single" w:sz="4" w:space="0" w:color="000000"/>
-              <w:bottom w:val="single" w:sz="4" w:space="0" w:color="000000"/>
-              <w:right w:val="single" w:sz="4" w:space="0" w:color="000000"/>
-            </w:tcBorders>
-            <w:shd w:val="clear" w:color="auto" w:fill="FFFFFF"/>
-            <w:vAlign w:val="center"/>
-          </w:tcPr>
-          <w:p>
-            <w:pPr>
-              <w:spacing w:before="20" w:after="20" w:lineRule="auto" w:line="216"/>
-              <w:ind w:firstLine="0" w:left="0"/>
-              <w:jc w:val="left"/>
-            </w:pPr>
-            <w:r/>
-            <w:r>
-              <w:rPr>
-                <w:rFonts w:ascii="宋体" w:hAnsi="宋体" w:eastAsia="宋体" w:cs="宋体"/>
-                <w:b w:val="0"/>
-                <w:i w:val="0"/>
-                <w:sz w:val="21"/>
-              </w:rPr>
               <w:t>生效日期</w:t>
             </w:r>
           </w:p>
@@ -677,7 +547,7 @@
           <w:i w:val="0"/>
           <w:sz w:val="24"/>
         </w:rPr>
-        <w:t>1.1  本规程规定生产设备的分类原则、分类后的管理要求和唯一编号规则，并规定仪器的编号规则。仪器只按本规程编号，不按本规程分类，也不按本规程实施使用、维护、确认和校准管理。</w:t>
+        <w:t>1.1  本规程规定生产设备的分类原则和程序，以及设备、仪器的编号原则和程序，使公司设备、仪器具有统一、唯一的编号，便于识别、使用、维护和管理。</w:t>
       </w:r>
     </w:p>
     <w:p>
@@ -709,7 +579,7 @@
           <w:i w:val="0"/>
           <w:sz w:val="24"/>
         </w:rPr>
-        <w:t>2.1  本规程的设备分类和第6.3款管理要求，适用于公司生产设备、独立辅助设备、配电及电力设备和办公及其他设备。这些设备同时适用本规程的编号规则。</w:t>
+        <w:t>2.1  本规程适用于生产设备的分类，以及设备、仪器的编号。</w:t>
       </w:r>
     </w:p>
     <w:p>
@@ -725,39 +595,7 @@
           <w:i w:val="0"/>
           <w:sz w:val="24"/>
         </w:rPr>
-        <w:t>2.2  仪器只适用本规程第6.4款至第6.8款的编号规则，包括编号结构、代号、配号、变更、注销，以及台账中的编号信息。仪器的分类、校准、使用、维护和记录执行其适用的管理规程。</w:t>
-      </w:r>
-    </w:p>
-    <w:p>
-      <w:pPr>
-        <w:spacing w:before="0" w:after="60" w:lineRule="auto" w:line="240"/>
-        <w:ind w:firstLine="0" w:left="0"/>
-        <w:jc w:val="both"/>
-      </w:pPr>
-      <w:r>
-        <w:rPr>
-          <w:rFonts w:ascii="宋体" w:hAnsi="宋体" w:eastAsia="宋体" w:cs="宋体"/>
-          <w:b w:val="0"/>
-          <w:i w:val="0"/>
-          <w:sz w:val="24"/>
-        </w:rPr>
-        <w:t>2.3  质量控制部仪器的分类、校准和检验使用管理执行 SMP-QC-000-021《检验仪器管理规程》。该类仪器的编号执行本规程，并登记在公司设备台账中。</w:t>
-      </w:r>
-    </w:p>
-    <w:p>
-      <w:pPr>
-        <w:spacing w:before="0" w:after="60" w:lineRule="auto" w:line="240"/>
-        <w:ind w:firstLine="0" w:left="0"/>
-        <w:jc w:val="both"/>
-      </w:pPr>
-      <w:r>
-        <w:rPr>
-          <w:rFonts w:ascii="宋体" w:hAnsi="宋体" w:eastAsia="宋体" w:cs="宋体"/>
-          <w:b w:val="0"/>
-          <w:i w:val="0"/>
-          <w:sz w:val="24"/>
-        </w:rPr>
-        <w:t>2.4  设备的系统影响性评估和组件关键性评估执行 SMP-QA-000-037《系统影响性评估及组件关键性评估管理规程》。本规程根据该评估结论确定设备的 A 类或 B 类管理要求。</w:t>
+        <w:t>2.2  本规程对质量控制部只适用于仪器编号。质量控制部仪器的分类执行 SMP-QC-000-021《检验仪器管理规程》。</w:t>
       </w:r>
     </w:p>
     <w:p>
@@ -789,7 +627,7 @@
           <w:i w:val="0"/>
           <w:sz w:val="24"/>
         </w:rPr>
-        <w:t>3.1  设备工程部负责人与 QA 监督本规程的实施。发现编号重复、设备管理类别与评估结论不一致，或现场标识与设备台账不一致时，应当督促责任部门纠正。</w:t>
+        <w:t>3.1  设备工程部负责人和 QA 负责监督本规程的实施。</w:t>
       </w:r>
     </w:p>
     <w:p>
@@ -805,55 +643,7 @@
           <w:i w:val="0"/>
           <w:sz w:val="24"/>
         </w:rPr>
-        <w:t>3.2  设备工程部维护公司设备台账，按本规程配发编号、登记编号变更并冻结已注销编号，保证现行编号唯一。</w:t>
-      </w:r>
-    </w:p>
-    <w:p>
-      <w:pPr>
-        <w:spacing w:before="0" w:after="60" w:lineRule="auto" w:line="240"/>
-        <w:ind w:firstLine="0" w:left="0"/>
-        <w:jc w:val="both"/>
-      </w:pPr>
-      <w:r>
-        <w:rPr>
-          <w:rFonts w:ascii="宋体" w:hAnsi="宋体" w:eastAsia="宋体" w:cs="宋体"/>
-          <w:b w:val="0"/>
-          <w:i w:val="0"/>
-          <w:sz w:val="24"/>
-        </w:rPr>
-        <w:t>3.3  设备归属部门提供设备的使用地点、用途和系统影响性评估结论；指定 A 类设备负责人；组织本部门设备操作规程、清洁规程和维护规程的起草、修订、审核和培训；完成设备负责人交接。</w:t>
-      </w:r>
-    </w:p>
-    <w:p>
-      <w:pPr>
-        <w:spacing w:before="0" w:after="60" w:lineRule="auto" w:line="240"/>
-        <w:ind w:firstLine="0" w:left="0"/>
-        <w:jc w:val="both"/>
-      </w:pPr>
-      <w:r>
-        <w:rPr>
-          <w:rFonts w:ascii="宋体" w:hAnsi="宋体" w:eastAsia="宋体" w:cs="宋体"/>
-          <w:b w:val="0"/>
-          <w:i w:val="0"/>
-          <w:sz w:val="24"/>
-        </w:rPr>
-        <w:t>3.4  仪器所在部门应当提供仪器名称、型号、出厂编号、安装地点和编号所需的大类、部门信息，并使现场仪器编号与设备台账一致。仪器的分类、校准和使用管理不由本规程规定。质量控制部仪器的上述管理执行 SMP-QC-000-021。</w:t>
-      </w:r>
-    </w:p>
-    <w:p>
-      <w:pPr>
-        <w:spacing w:before="0" w:after="60" w:lineRule="auto" w:line="240"/>
-        <w:ind w:firstLine="0" w:left="0"/>
-        <w:jc w:val="both"/>
-      </w:pPr>
-      <w:r>
-        <w:rPr>
-          <w:rFonts w:ascii="宋体" w:hAnsi="宋体" w:eastAsia="宋体" w:cs="宋体"/>
-          <w:b w:val="0"/>
-          <w:i w:val="0"/>
-          <w:sz w:val="24"/>
-        </w:rPr>
-        <w:t>3.5  设备使用人员按现场编号和状态标识使用设备，并如实填写使用日志及其他适用记录。仪器使用人员使用本规程配发的编号；仪器的使用和记录执行其适用规程。</w:t>
+        <w:t>3.2  设备工程部及相关人员负责执行本规程。设备归属部门按第6.2款组织本部门设备规程的起草、修订、审核和培训，并指定 A 类设备负责人、完成交接。</w:t>
       </w:r>
     </w:p>
     <w:p>
@@ -885,7 +675,7 @@
           <w:i w:val="0"/>
           <w:sz w:val="24"/>
         </w:rPr>
-        <w:t>4.1  《药品生产质量管理规范（2010年修订）》（卫生部令第79号）第七十一条、第七十二条、第七十三条、第七十九条、第八十条、第八十一条、第八十二条、第八十三条、第八十六条、第八十七条和第八十八条。上述条款在本规程中用于设备。仪器的校准和使用管理执行其适用规程。</w:t>
+        <w:t>4.1  《药品生产质量管理规范（2010年修订）》（卫生部令第79号）。</w:t>
       </w:r>
     </w:p>
     <w:p>
@@ -901,7 +691,7 @@
           <w:i w:val="0"/>
           <w:sz w:val="24"/>
         </w:rPr>
-        <w:t>4.2  本规程引用的企业内部制度见下表。引用文本修订时，活动按修订后的受控文本执行。</w:t>
+        <w:t>4.2  本规程引用下列已有公司文件。文件修订后，按修订后的受控文本执行。</w:t>
       </w:r>
     </w:p>
     <w:p>
@@ -917,7 +707,7 @@
           <w:i w:val="0"/>
           <w:sz w:val="21"/>
         </w:rPr>
-        <w:t>表1  引用的企业内部制度</w:t>
+        <w:t>表1  引用文件</w:t>
       </w:r>
     </w:p>
     <w:tbl>
@@ -969,7 +759,7 @@
         </w:tc>
         <w:tc>
           <w:tcPr>
-            <w:tcW w:type="dxa" w:w="3628"/>
+            <w:tcW w:type="dxa" w:w="4082"/>
             <w:tcBorders>
               <w:top w:val="single" w:sz="4" w:space="0" w:color="000000"/>
               <w:left w:val="single" w:sz="4" w:space="0" w:color="000000"/>
@@ -999,7 +789,7 @@
         </w:tc>
         <w:tc>
           <w:tcPr>
-            <w:tcW w:type="dxa" w:w="3231"/>
+            <w:tcW w:type="dxa" w:w="2778"/>
             <w:tcBorders>
               <w:top w:val="single" w:sz="4" w:space="0" w:color="000000"/>
               <w:left w:val="single" w:sz="4" w:space="0" w:color="000000"/>
@@ -1023,7 +813,7 @@
                 <w:i w:val="0"/>
                 <w:sz w:val="21"/>
               </w:rPr>
-              <w:t>在本规程中的用途</w:t>
+              <w:t>用途</w:t>
             </w:r>
           </w:p>
         </w:tc>
@@ -1064,7 +854,7 @@
         </w:tc>
         <w:tc>
           <w:tcPr>
-            <w:tcW w:type="dxa" w:w="3628"/>
+            <w:tcW w:type="dxa" w:w="4082"/>
             <w:tcBorders>
               <w:top w:val="single" w:sz="4" w:space="0" w:color="000000"/>
               <w:left w:val="single" w:sz="4" w:space="0" w:color="000000"/>
@@ -1094,7 +884,7 @@
         </w:tc>
         <w:tc>
           <w:tcPr>
-            <w:tcW w:type="dxa" w:w="3231"/>
+            <w:tcW w:type="dxa" w:w="2778"/>
             <w:tcBorders>
               <w:top w:val="single" w:sz="4" w:space="0" w:color="000000"/>
               <w:left w:val="single" w:sz="4" w:space="0" w:color="000000"/>
@@ -1118,7 +908,7 @@
                 <w:i w:val="0"/>
                 <w:sz w:val="21"/>
               </w:rPr>
-              <w:t>确定设备的直接影响系统、非直接影响系统及组件关键性</w:t>
+              <w:t>确定系统影响性评估结论</w:t>
             </w:r>
           </w:p>
         </w:tc>
@@ -1159,7 +949,7 @@
         </w:tc>
         <w:tc>
           <w:tcPr>
-            <w:tcW w:type="dxa" w:w="3628"/>
+            <w:tcW w:type="dxa" w:w="4082"/>
             <w:tcBorders>
               <w:top w:val="single" w:sz="4" w:space="0" w:color="000000"/>
               <w:left w:val="single" w:sz="4" w:space="0" w:color="000000"/>
@@ -1189,7 +979,7 @@
         </w:tc>
         <w:tc>
           <w:tcPr>
-            <w:tcW w:type="dxa" w:w="3231"/>
+            <w:tcW w:type="dxa" w:w="2778"/>
             <w:tcBorders>
               <w:top w:val="single" w:sz="4" w:space="0" w:color="000000"/>
               <w:left w:val="single" w:sz="4" w:space="0" w:color="000000"/>
@@ -1213,7 +1003,102 @@
                 <w:i w:val="0"/>
                 <w:sz w:val="21"/>
               </w:rPr>
-              <w:t>改变管理类别、编号或代码表</w:t>
+              <w:t>改变已确定的设备类别</w:t>
+            </w:r>
+          </w:p>
+        </w:tc>
+      </w:tr>
+      <w:tr>
+        <w:trPr>
+          <w:cantSplit/>
+        </w:trPr>
+        <w:tc>
+          <w:tcPr>
+            <w:tcW w:type="dxa" w:w="2154"/>
+            <w:tcBorders>
+              <w:top w:val="single" w:sz="4" w:space="0" w:color="000000"/>
+              <w:left w:val="single" w:sz="4" w:space="0" w:color="000000"/>
+              <w:bottom w:val="single" w:sz="4" w:space="0" w:color="000000"/>
+              <w:right w:val="single" w:sz="4" w:space="0" w:color="000000"/>
+            </w:tcBorders>
+            <w:shd w:val="clear" w:color="auto" w:fill="FFFFFF"/>
+            <w:vAlign w:val="center"/>
+          </w:tcPr>
+          <w:p>
+            <w:pPr>
+              <w:spacing w:before="20" w:after="20" w:lineRule="auto" w:line="216"/>
+              <w:ind w:firstLine="0" w:left="0"/>
+              <w:jc w:val="left"/>
+            </w:pPr>
+            <w:r/>
+            <w:r>
+              <w:rPr>
+                <w:rFonts w:ascii="宋体" w:hAnsi="宋体" w:eastAsia="宋体" w:cs="宋体"/>
+                <w:b w:val="0"/>
+                <w:i w:val="0"/>
+                <w:sz w:val="21"/>
+              </w:rPr>
+              <w:t>SMP-QC-000-021</w:t>
+            </w:r>
+          </w:p>
+        </w:tc>
+        <w:tc>
+          <w:tcPr>
+            <w:tcW w:type="dxa" w:w="4082"/>
+            <w:tcBorders>
+              <w:top w:val="single" w:sz="4" w:space="0" w:color="000000"/>
+              <w:left w:val="single" w:sz="4" w:space="0" w:color="000000"/>
+              <w:bottom w:val="single" w:sz="4" w:space="0" w:color="000000"/>
+              <w:right w:val="single" w:sz="4" w:space="0" w:color="000000"/>
+            </w:tcBorders>
+            <w:shd w:val="clear" w:color="auto" w:fill="FFFFFF"/>
+            <w:vAlign w:val="center"/>
+          </w:tcPr>
+          <w:p>
+            <w:pPr>
+              <w:spacing w:before="20" w:after="20" w:lineRule="auto" w:line="216"/>
+              <w:ind w:firstLine="0" w:left="0"/>
+              <w:jc w:val="left"/>
+            </w:pPr>
+            <w:r/>
+            <w:r>
+              <w:rPr>
+                <w:rFonts w:ascii="宋体" w:hAnsi="宋体" w:eastAsia="宋体" w:cs="宋体"/>
+                <w:b w:val="0"/>
+                <w:i w:val="0"/>
+                <w:sz w:val="21"/>
+              </w:rPr>
+              <w:t>检验仪器管理规程</w:t>
+            </w:r>
+          </w:p>
+        </w:tc>
+        <w:tc>
+          <w:tcPr>
+            <w:tcW w:type="dxa" w:w="2778"/>
+            <w:tcBorders>
+              <w:top w:val="single" w:sz="4" w:space="0" w:color="000000"/>
+              <w:left w:val="single" w:sz="4" w:space="0" w:color="000000"/>
+              <w:bottom w:val="single" w:sz="4" w:space="0" w:color="000000"/>
+              <w:right w:val="single" w:sz="4" w:space="0" w:color="000000"/>
+            </w:tcBorders>
+            <w:shd w:val="clear" w:color="auto" w:fill="FFFFFF"/>
+            <w:vAlign w:val="center"/>
+          </w:tcPr>
+          <w:p>
+            <w:pPr>
+              <w:spacing w:before="20" w:after="20" w:lineRule="auto" w:line="216"/>
+              <w:ind w:firstLine="0" w:left="0"/>
+              <w:jc w:val="left"/>
+            </w:pPr>
+            <w:r/>
+            <w:r>
+              <w:rPr>
+                <w:rFonts w:ascii="宋体" w:hAnsi="宋体" w:eastAsia="宋体" w:cs="宋体"/>
+                <w:b w:val="0"/>
+                <w:i w:val="0"/>
+                <w:sz w:val="21"/>
+              </w:rPr>
+              <w:t>质量控制部仪器的分类</w:t>
             </w:r>
           </w:p>
         </w:tc>
@@ -1254,7 +1139,7 @@
         </w:tc>
         <w:tc>
           <w:tcPr>
-            <w:tcW w:type="dxa" w:w="3628"/>
+            <w:tcW w:type="dxa" w:w="4082"/>
             <w:tcBorders>
               <w:top w:val="single" w:sz="4" w:space="0" w:color="000000"/>
               <w:left w:val="single" w:sz="4" w:space="0" w:color="000000"/>
@@ -1284,7 +1169,7 @@
         </w:tc>
         <w:tc>
           <w:tcPr>
-            <w:tcW w:type="dxa" w:w="3231"/>
+            <w:tcW w:type="dxa" w:w="2778"/>
             <w:tcBorders>
               <w:top w:val="single" w:sz="4" w:space="0" w:color="000000"/>
               <w:left w:val="single" w:sz="4" w:space="0" w:color="000000"/>
@@ -1308,7 +1193,102 @@
                 <w:i w:val="0"/>
                 <w:sz w:val="21"/>
               </w:rPr>
-              <w:t>确定确认对象并实施确认、再确认</w:t>
+              <w:t>设备确认</w:t>
+            </w:r>
+          </w:p>
+        </w:tc>
+      </w:tr>
+      <w:tr>
+        <w:trPr>
+          <w:cantSplit/>
+        </w:trPr>
+        <w:tc>
+          <w:tcPr>
+            <w:tcW w:type="dxa" w:w="2154"/>
+            <w:tcBorders>
+              <w:top w:val="single" w:sz="4" w:space="0" w:color="000000"/>
+              <w:left w:val="single" w:sz="4" w:space="0" w:color="000000"/>
+              <w:bottom w:val="single" w:sz="4" w:space="0" w:color="000000"/>
+              <w:right w:val="single" w:sz="4" w:space="0" w:color="000000"/>
+            </w:tcBorders>
+            <w:shd w:val="clear" w:color="auto" w:fill="FFFFFF"/>
+            <w:vAlign w:val="center"/>
+          </w:tcPr>
+          <w:p>
+            <w:pPr>
+              <w:spacing w:before="20" w:after="20" w:lineRule="auto" w:line="216"/>
+              <w:ind w:firstLine="0" w:left="0"/>
+              <w:jc w:val="left"/>
+            </w:pPr>
+            <w:r/>
+            <w:r>
+              <w:rPr>
+                <w:rFonts w:ascii="宋体" w:hAnsi="宋体" w:eastAsia="宋体" w:cs="宋体"/>
+                <w:b w:val="0"/>
+                <w:i w:val="0"/>
+                <w:sz w:val="21"/>
+              </w:rPr>
+              <w:t>SMP-EQ-100-004</w:t>
+            </w:r>
+          </w:p>
+        </w:tc>
+        <w:tc>
+          <w:tcPr>
+            <w:tcW w:type="dxa" w:w="4082"/>
+            <w:tcBorders>
+              <w:top w:val="single" w:sz="4" w:space="0" w:color="000000"/>
+              <w:left w:val="single" w:sz="4" w:space="0" w:color="000000"/>
+              <w:bottom w:val="single" w:sz="4" w:space="0" w:color="000000"/>
+              <w:right w:val="single" w:sz="4" w:space="0" w:color="000000"/>
+            </w:tcBorders>
+            <w:shd w:val="clear" w:color="auto" w:fill="FFFFFF"/>
+            <w:vAlign w:val="center"/>
+          </w:tcPr>
+          <w:p>
+            <w:pPr>
+              <w:spacing w:before="20" w:after="20" w:lineRule="auto" w:line="216"/>
+              <w:ind w:firstLine="0" w:left="0"/>
+              <w:jc w:val="left"/>
+            </w:pPr>
+            <w:r/>
+            <w:r>
+              <w:rPr>
+                <w:rFonts w:ascii="宋体" w:hAnsi="宋体" w:eastAsia="宋体" w:cs="宋体"/>
+                <w:b w:val="0"/>
+                <w:i w:val="0"/>
+                <w:sz w:val="21"/>
+              </w:rPr>
+              <w:t>设备设施故障报告与维修管理规程</w:t>
+            </w:r>
+          </w:p>
+        </w:tc>
+        <w:tc>
+          <w:tcPr>
+            <w:tcW w:type="dxa" w:w="2778"/>
+            <w:tcBorders>
+              <w:top w:val="single" w:sz="4" w:space="0" w:color="000000"/>
+              <w:left w:val="single" w:sz="4" w:space="0" w:color="000000"/>
+              <w:bottom w:val="single" w:sz="4" w:space="0" w:color="000000"/>
+              <w:right w:val="single" w:sz="4" w:space="0" w:color="000000"/>
+            </w:tcBorders>
+            <w:shd w:val="clear" w:color="auto" w:fill="FFFFFF"/>
+            <w:vAlign w:val="center"/>
+          </w:tcPr>
+          <w:p>
+            <w:pPr>
+              <w:spacing w:before="20" w:after="20" w:lineRule="auto" w:line="216"/>
+              <w:ind w:firstLine="0" w:left="0"/>
+              <w:jc w:val="left"/>
+            </w:pPr>
+            <w:r/>
+            <w:r>
+              <w:rPr>
+                <w:rFonts w:ascii="宋体" w:hAnsi="宋体" w:eastAsia="宋体" w:cs="宋体"/>
+                <w:b w:val="0"/>
+                <w:i w:val="0"/>
+                <w:sz w:val="21"/>
+              </w:rPr>
+              <w:t>设备维修</w:t>
             </w:r>
           </w:p>
         </w:tc>
@@ -1349,7 +1329,7 @@
         </w:tc>
         <w:tc>
           <w:tcPr>
-            <w:tcW w:type="dxa" w:w="3628"/>
+            <w:tcW w:type="dxa" w:w="4082"/>
             <w:tcBorders>
               <w:top w:val="single" w:sz="4" w:space="0" w:color="000000"/>
               <w:left w:val="single" w:sz="4" w:space="0" w:color="000000"/>
@@ -1379,7 +1359,7 @@
         </w:tc>
         <w:tc>
           <w:tcPr>
-            <w:tcW w:type="dxa" w:w="3231"/>
+            <w:tcW w:type="dxa" w:w="2778"/>
             <w:tcBorders>
               <w:top w:val="single" w:sz="4" w:space="0" w:color="000000"/>
               <w:left w:val="single" w:sz="4" w:space="0" w:color="000000"/>
@@ -1403,197 +1383,7 @@
                 <w:i w:val="0"/>
                 <w:sz w:val="21"/>
               </w:rPr>
-              <w:t>预防性维护及其维修安排</w:t>
-            </w:r>
-          </w:p>
-        </w:tc>
-      </w:tr>
-      <w:tr>
-        <w:trPr>
-          <w:cantSplit/>
-        </w:trPr>
-        <w:tc>
-          <w:tcPr>
-            <w:tcW w:type="dxa" w:w="2154"/>
-            <w:tcBorders>
-              <w:top w:val="single" w:sz="4" w:space="0" w:color="000000"/>
-              <w:left w:val="single" w:sz="4" w:space="0" w:color="000000"/>
-              <w:bottom w:val="single" w:sz="4" w:space="0" w:color="000000"/>
-              <w:right w:val="single" w:sz="4" w:space="0" w:color="000000"/>
-            </w:tcBorders>
-            <w:shd w:val="clear" w:color="auto" w:fill="FFFFFF"/>
-            <w:vAlign w:val="center"/>
-          </w:tcPr>
-          <w:p>
-            <w:pPr>
-              <w:spacing w:before="20" w:after="20" w:lineRule="auto" w:line="216"/>
-              <w:ind w:firstLine="0" w:left="0"/>
-              <w:jc w:val="left"/>
-            </w:pPr>
-            <w:r/>
-            <w:r>
-              <w:rPr>
-                <w:rFonts w:ascii="宋体" w:hAnsi="宋体" w:eastAsia="宋体" w:cs="宋体"/>
-                <w:b w:val="0"/>
-                <w:i w:val="0"/>
-                <w:sz w:val="21"/>
-              </w:rPr>
-              <w:t>SMP-EQ-100-004</w:t>
-            </w:r>
-          </w:p>
-        </w:tc>
-        <w:tc>
-          <w:tcPr>
-            <w:tcW w:type="dxa" w:w="3628"/>
-            <w:tcBorders>
-              <w:top w:val="single" w:sz="4" w:space="0" w:color="000000"/>
-              <w:left w:val="single" w:sz="4" w:space="0" w:color="000000"/>
-              <w:bottom w:val="single" w:sz="4" w:space="0" w:color="000000"/>
-              <w:right w:val="single" w:sz="4" w:space="0" w:color="000000"/>
-            </w:tcBorders>
-            <w:shd w:val="clear" w:color="auto" w:fill="FFFFFF"/>
-            <w:vAlign w:val="center"/>
-          </w:tcPr>
-          <w:p>
-            <w:pPr>
-              <w:spacing w:before="20" w:after="20" w:lineRule="auto" w:line="216"/>
-              <w:ind w:firstLine="0" w:left="0"/>
-              <w:jc w:val="left"/>
-            </w:pPr>
-            <w:r/>
-            <w:r>
-              <w:rPr>
-                <w:rFonts w:ascii="宋体" w:hAnsi="宋体" w:eastAsia="宋体" w:cs="宋体"/>
-                <w:b w:val="0"/>
-                <w:i w:val="0"/>
-                <w:sz w:val="21"/>
-              </w:rPr>
-              <w:t>设备设施故障报告与维修管理规程</w:t>
-            </w:r>
-          </w:p>
-        </w:tc>
-        <w:tc>
-          <w:tcPr>
-            <w:tcW w:type="dxa" w:w="3231"/>
-            <w:tcBorders>
-              <w:top w:val="single" w:sz="4" w:space="0" w:color="000000"/>
-              <w:left w:val="single" w:sz="4" w:space="0" w:color="000000"/>
-              <w:bottom w:val="single" w:sz="4" w:space="0" w:color="000000"/>
-              <w:right w:val="single" w:sz="4" w:space="0" w:color="000000"/>
-            </w:tcBorders>
-            <w:shd w:val="clear" w:color="auto" w:fill="FFFFFF"/>
-            <w:vAlign w:val="center"/>
-          </w:tcPr>
-          <w:p>
-            <w:pPr>
-              <w:spacing w:before="20" w:after="20" w:lineRule="auto" w:line="216"/>
-              <w:ind w:firstLine="0" w:left="0"/>
-              <w:jc w:val="left"/>
-            </w:pPr>
-            <w:r/>
-            <w:r>
-              <w:rPr>
-                <w:rFonts w:ascii="宋体" w:hAnsi="宋体" w:eastAsia="宋体" w:cs="宋体"/>
-                <w:b w:val="0"/>
-                <w:i w:val="0"/>
-                <w:sz w:val="21"/>
-              </w:rPr>
-              <w:t>故障报告与维修</w:t>
-            </w:r>
-          </w:p>
-        </w:tc>
-      </w:tr>
-      <w:tr>
-        <w:trPr>
-          <w:cantSplit/>
-        </w:trPr>
-        <w:tc>
-          <w:tcPr>
-            <w:tcW w:type="dxa" w:w="2154"/>
-            <w:tcBorders>
-              <w:top w:val="single" w:sz="4" w:space="0" w:color="000000"/>
-              <w:left w:val="single" w:sz="4" w:space="0" w:color="000000"/>
-              <w:bottom w:val="single" w:sz="4" w:space="0" w:color="000000"/>
-              <w:right w:val="single" w:sz="4" w:space="0" w:color="000000"/>
-            </w:tcBorders>
-            <w:shd w:val="clear" w:color="auto" w:fill="FFFFFF"/>
-            <w:vAlign w:val="center"/>
-          </w:tcPr>
-          <w:p>
-            <w:pPr>
-              <w:spacing w:before="20" w:after="20" w:lineRule="auto" w:line="216"/>
-              <w:ind w:firstLine="0" w:left="0"/>
-              <w:jc w:val="left"/>
-            </w:pPr>
-            <w:r/>
-            <w:r>
-              <w:rPr>
-                <w:rFonts w:ascii="宋体" w:hAnsi="宋体" w:eastAsia="宋体" w:cs="宋体"/>
-                <w:b w:val="0"/>
-                <w:i w:val="0"/>
-                <w:sz w:val="21"/>
-              </w:rPr>
-              <w:t>SMP-QC-000-021</w:t>
-            </w:r>
-          </w:p>
-        </w:tc>
-        <w:tc>
-          <w:tcPr>
-            <w:tcW w:type="dxa" w:w="3628"/>
-            <w:tcBorders>
-              <w:top w:val="single" w:sz="4" w:space="0" w:color="000000"/>
-              <w:left w:val="single" w:sz="4" w:space="0" w:color="000000"/>
-              <w:bottom w:val="single" w:sz="4" w:space="0" w:color="000000"/>
-              <w:right w:val="single" w:sz="4" w:space="0" w:color="000000"/>
-            </w:tcBorders>
-            <w:shd w:val="clear" w:color="auto" w:fill="FFFFFF"/>
-            <w:vAlign w:val="center"/>
-          </w:tcPr>
-          <w:p>
-            <w:pPr>
-              <w:spacing w:before="20" w:after="20" w:lineRule="auto" w:line="216"/>
-              <w:ind w:firstLine="0" w:left="0"/>
-              <w:jc w:val="left"/>
-            </w:pPr>
-            <w:r/>
-            <w:r>
-              <w:rPr>
-                <w:rFonts w:ascii="宋体" w:hAnsi="宋体" w:eastAsia="宋体" w:cs="宋体"/>
-                <w:b w:val="0"/>
-                <w:i w:val="0"/>
-                <w:sz w:val="21"/>
-              </w:rPr>
-              <w:t>检验仪器管理规程</w:t>
-            </w:r>
-          </w:p>
-        </w:tc>
-        <w:tc>
-          <w:tcPr>
-            <w:tcW w:type="dxa" w:w="3231"/>
-            <w:tcBorders>
-              <w:top w:val="single" w:sz="4" w:space="0" w:color="000000"/>
-              <w:left w:val="single" w:sz="4" w:space="0" w:color="000000"/>
-              <w:bottom w:val="single" w:sz="4" w:space="0" w:color="000000"/>
-              <w:right w:val="single" w:sz="4" w:space="0" w:color="000000"/>
-            </w:tcBorders>
-            <w:shd w:val="clear" w:color="auto" w:fill="FFFFFF"/>
-            <w:vAlign w:val="center"/>
-          </w:tcPr>
-          <w:p>
-            <w:pPr>
-              <w:spacing w:before="20" w:after="20" w:lineRule="auto" w:line="216"/>
-              <w:ind w:firstLine="0" w:left="0"/>
-              <w:jc w:val="left"/>
-            </w:pPr>
-            <w:r/>
-            <w:r>
-              <w:rPr>
-                <w:rFonts w:ascii="宋体" w:hAnsi="宋体" w:eastAsia="宋体" w:cs="宋体"/>
-                <w:b w:val="0"/>
-                <w:i w:val="0"/>
-                <w:sz w:val="21"/>
-              </w:rPr>
-              <w:t>质量控制部仪器的分类、校准和检验使用管理；本规程只为其配号</w:t>
+              <w:t>设备预防性维护</w:t>
             </w:r>
           </w:p>
         </w:tc>
@@ -1612,7 +1402,7 @@
           <w:i w:val="0"/>
           <w:sz w:val="24"/>
         </w:rPr>
-        <w:t>4.3  本规程中的“确认”对应 qualification，“预防性维护”对应 preventive maintenance，设备编号用于实现 unique identification。中国生产现场按第4.1款和表1执行。</w:t>
+        <w:t>4.3  本规程中的“确认”对应 qualification，“预防性维护”对应 preventive maintenance。设备、仪器编号用于唯一识别，对应 unique identification。</w:t>
       </w:r>
     </w:p>
     <w:p>
@@ -1644,7 +1434,7 @@
           <w:i w:val="0"/>
           <w:sz w:val="24"/>
         </w:rPr>
-        <w:t>5.1  设备归属部门：对设备的日常使用、操作规程和现场管理承担责任的部门。</w:t>
+        <w:t>5.1  直接影响系统、非直接影响系统：按 SMP-QA-000-037 得出的系统影响性评估结论。</w:t>
       </w:r>
     </w:p>
     <w:p>
@@ -1660,7 +1450,7 @@
           <w:i w:val="0"/>
           <w:sz w:val="24"/>
         </w:rPr>
-        <w:t>5.2  直接影响系统：按 SMP-QA-000-037 评估，运行或失效预期会对产品质量产生直接影响的系统。</w:t>
+        <w:t>5.2  A 类设备：系统影响性评估结论为直接影响系统的设备。</w:t>
       </w:r>
     </w:p>
     <w:p>
@@ -1676,7 +1466,7 @@
           <w:i w:val="0"/>
           <w:sz w:val="24"/>
         </w:rPr>
-        <w:t>5.3  非直接影响系统：按 SMP-QA-000-037 评估，自身不直接决定产品质量，而用于支持直接影响系统的系统。</w:t>
+        <w:t>5.3  B 类设备：系统影响性评估结论为非直接影响系统的设备。</w:t>
       </w:r>
     </w:p>
     <w:p>
@@ -1692,7 +1482,7 @@
           <w:i w:val="0"/>
           <w:sz w:val="24"/>
         </w:rPr>
-        <w:t>5.4  A 类设备：系统影响性评估结论为直接影响系统的设备。</w:t>
+        <w:t>5.4  设备归属部门：组织本部门设备操作规程、清洁规程和维护规程的起草、修订、审核和培训的部门。</w:t>
       </w:r>
     </w:p>
     <w:p>
@@ -1708,7 +1498,7 @@
           <w:i w:val="0"/>
           <w:sz w:val="24"/>
         </w:rPr>
-        <w:t>5.5  B 类设备：系统影响性评估结论为非直接影响系统的设备。</w:t>
+        <w:t>5.5  一级编号：由设备大类代号、部门代号和三位流水号依次连接形成的编号。</w:t>
       </w:r>
     </w:p>
     <w:p>
@@ -1724,7 +1514,7 @@
           <w:i w:val="0"/>
           <w:sz w:val="24"/>
         </w:rPr>
-        <w:t>5.6  独立辅助设备：可以独立使用，或同时服务于一台以上主设备，并单独列入设备台账的辅助设备。其大类代号为 F。</w:t>
+        <w:t>5.6  二级编号：在一级编号后加半角连字符“-”和两位辅助设备或附属装置序号形成的编号。</w:t>
       </w:r>
     </w:p>
     <w:p>
@@ -1740,103 +1530,7 @@
           <w:i w:val="0"/>
           <w:sz w:val="24"/>
         </w:rPr>
-        <w:t>5.7  附属装置：固定服务于一台主设备，并随该主设备一并管理的装置。附属装置使用该主设备的二级编号。</w:t>
-      </w:r>
-    </w:p>
-    <w:p>
-      <w:pPr>
-        <w:spacing w:before="0" w:after="60" w:lineRule="auto" w:line="240"/>
-        <w:ind w:firstLine="0" w:left="0"/>
-        <w:jc w:val="both"/>
-      </w:pPr>
-      <w:r>
-        <w:rPr>
-          <w:rFonts w:ascii="宋体" w:hAnsi="宋体" w:eastAsia="宋体" w:cs="宋体"/>
-          <w:b w:val="0"/>
-          <w:i w:val="0"/>
-          <w:sz w:val="24"/>
-        </w:rPr>
-        <w:t>5.8  一级编号：由设备大类代号、部门代号和三位流水号依次连接形成的编号。</w:t>
-      </w:r>
-    </w:p>
-    <w:p>
-      <w:pPr>
-        <w:spacing w:before="0" w:after="60" w:lineRule="auto" w:line="240"/>
-        <w:ind w:firstLine="0" w:left="0"/>
-        <w:jc w:val="both"/>
-      </w:pPr>
-      <w:r>
-        <w:rPr>
-          <w:rFonts w:ascii="宋体" w:hAnsi="宋体" w:eastAsia="宋体" w:cs="宋体"/>
-          <w:b w:val="0"/>
-          <w:i w:val="0"/>
-          <w:sz w:val="24"/>
-        </w:rPr>
-        <w:t>5.9  二级编号：在主设备一级编号后加上连字符和两位附属装置序号形成的编号。</w:t>
-      </w:r>
-    </w:p>
-    <w:p>
-      <w:pPr>
-        <w:spacing w:before="0" w:after="60" w:lineRule="auto" w:line="240"/>
-        <w:ind w:firstLine="0" w:left="0"/>
-        <w:jc w:val="both"/>
-      </w:pPr>
-      <w:r>
-        <w:rPr>
-          <w:rFonts w:ascii="宋体" w:hAnsi="宋体" w:eastAsia="宋体" w:cs="宋体"/>
-          <w:b w:val="0"/>
-          <w:i w:val="0"/>
-          <w:sz w:val="24"/>
-        </w:rPr>
-        <w:t>5.10  设备台账：登记设备的现行编号、管理类别、位置和状态，以及仪器现行编号的受控清单。经批准的纸质台账与电子台账均用于追溯。</w:t>
-      </w:r>
-    </w:p>
-    <w:p>
-      <w:pPr>
-        <w:spacing w:before="0" w:after="60" w:lineRule="auto" w:line="240"/>
-        <w:ind w:firstLine="0" w:left="0"/>
-        <w:jc w:val="both"/>
-      </w:pPr>
-      <w:r>
-        <w:rPr>
-          <w:rFonts w:ascii="宋体" w:hAnsi="宋体" w:eastAsia="宋体" w:cs="宋体"/>
-          <w:b w:val="0"/>
-          <w:i w:val="0"/>
-          <w:sz w:val="24"/>
-        </w:rPr>
-        <w:t>5.11  使用日志：用于药品生产的设备记录，内容包括使用、清洁、维护和维修情况以及日期、时间、所生产药品的名称、规格和批号等。本规程所称使用记录与使用日志为同一类记录。仪器的使用和校准记录不由本规程规定。</w:t>
-      </w:r>
-    </w:p>
-    <w:p>
-      <w:pPr>
-        <w:spacing w:before="0" w:after="60" w:lineRule="auto" w:line="240"/>
-        <w:ind w:firstLine="0" w:left="0"/>
-        <w:jc w:val="both"/>
-      </w:pPr>
-      <w:r>
-        <w:rPr>
-          <w:rFonts w:ascii="宋体" w:hAnsi="宋体" w:eastAsia="宋体" w:cs="宋体"/>
-          <w:b w:val="0"/>
-          <w:i w:val="0"/>
-          <w:sz w:val="24"/>
-        </w:rPr>
-        <w:t>5.12  仪器：本规程中需要编号的检测、测量或记录器具，大类代号为 J。仪器只执行编号规则。</w:t>
-      </w:r>
-    </w:p>
-    <w:p>
-      <w:pPr>
-        <w:spacing w:before="0" w:after="60" w:lineRule="auto" w:line="240"/>
-        <w:ind w:firstLine="0" w:left="0"/>
-        <w:jc w:val="both"/>
-      </w:pPr>
-      <w:r>
-        <w:rPr>
-          <w:rFonts w:ascii="宋体" w:hAnsi="宋体" w:eastAsia="宋体" w:cs="宋体"/>
-          <w:b w:val="0"/>
-          <w:i w:val="0"/>
-          <w:sz w:val="24"/>
-        </w:rPr>
-        <w:t>5.13  SMP-QA-000-037 对直接影响系统、非直接影响系统另有书面定义时，设备评估活动以该规程的定义为准。本规程第5.2款和第5.3款用于把设备的评估结论对应到 A 类、B 类。</w:t>
+        <w:t>5.7  辅助设备：有两种用法，含义不同。作为设备大类时，代号为 F，按一级编号编制。作为某台已编号设备的辅助设备或附属装置且需要二级编号时，序号附在该设备编号之后。</w:t>
       </w:r>
     </w:p>
     <w:p>
@@ -1868,7 +1562,7 @@
           <w:i w:val="0"/>
           <w:sz w:val="24"/>
         </w:rPr>
-        <w:t>6.1  分类与编号的关系</w:t>
+        <w:t>6.1  设备分类</w:t>
       </w:r>
     </w:p>
     <w:p>
@@ -1884,7 +1578,7 @@
           <w:i w:val="0"/>
           <w:sz w:val="24"/>
         </w:rPr>
-        <w:t>6.1.1  管理类别表示设备所属系统对产品质量的影响，只用于设备。编号表示设备或仪器的身份。设备的类别和编号同时登记在设备台账中。大类代号不代替 A 类或 B 类，A 类或 B 类不代替设备编号。</w:t>
+        <w:t>6.1.1  生产设备按 SMP-QA-000-037 进行系统影响性评估。评估结论为直接影响系统的，按 A 类管理；评估结论为非直接影响系统的，按 B 类管理。</w:t>
       </w:r>
     </w:p>
     <w:p>
@@ -1900,87 +1594,7 @@
           <w:i w:val="0"/>
           <w:sz w:val="24"/>
         </w:rPr>
-        <w:t>6.1.2  纳入设备台账的每台设备、仪器只有一个现行编号。完整编号在公司内唯一。</w:t>
-      </w:r>
-    </w:p>
-    <w:p>
-      <w:pPr>
-        <w:spacing w:before="0" w:after="60" w:lineRule="auto" w:line="240"/>
-        <w:ind w:firstLine="0" w:left="0"/>
-        <w:jc w:val="both"/>
-      </w:pPr>
-      <w:r>
-        <w:rPr>
-          <w:rFonts w:ascii="宋体" w:hAnsi="宋体" w:eastAsia="宋体" w:cs="宋体"/>
-          <w:b w:val="0"/>
-          <w:i w:val="0"/>
-          <w:sz w:val="24"/>
-        </w:rPr>
-        <w:t>6.1.3  编号在该设备或仪器存续期间保持稳定。设备或仪器报废、调出，或经变更控制批准重新编号后，原编号冻结，不再授予其他设备或仪器。历史记录继续沿用记录形成时的编号。</w:t>
-      </w:r>
-    </w:p>
-    <w:p>
-      <w:pPr>
-        <w:spacing w:before="0" w:after="60" w:lineRule="auto" w:line="240"/>
-        <w:ind w:firstLine="0" w:left="0"/>
-        <w:jc w:val="both"/>
-      </w:pPr>
-      <w:r>
-        <w:rPr>
-          <w:rFonts w:ascii="宋体" w:hAnsi="宋体" w:eastAsia="宋体" w:cs="宋体"/>
-          <w:b w:val="0"/>
-          <w:i w:val="0"/>
-          <w:sz w:val="24"/>
-        </w:rPr>
-        <w:t>6.1.4  仪器不划分 A 类或 B 类，不填写本规程的管理类别，只领取并使用编号。</w:t>
-      </w:r>
-    </w:p>
-    <w:p>
-      <w:pPr>
-        <w:spacing w:before="120" w:after="80" w:lineRule="auto" w:line="240"/>
-        <w:ind w:firstLine="0" w:left="0"/>
-        <w:jc w:val="left"/>
-      </w:pPr>
-      <w:r>
-        <w:rPr>
-          <w:rFonts w:ascii="宋体" w:hAnsi="宋体" w:eastAsia="宋体" w:cs="宋体"/>
-          <w:b/>
-          <w:i w:val="0"/>
-          <w:sz w:val="24"/>
-        </w:rPr>
-        <w:t>6.2  设备分类</w:t>
-      </w:r>
-    </w:p>
-    <w:p>
-      <w:pPr>
-        <w:spacing w:before="0" w:after="60" w:lineRule="auto" w:line="240"/>
-        <w:ind w:firstLine="0" w:left="0"/>
-        <w:jc w:val="both"/>
-      </w:pPr>
-      <w:r>
-        <w:rPr>
-          <w:rFonts w:ascii="宋体" w:hAnsi="宋体" w:eastAsia="宋体" w:cs="宋体"/>
-          <w:b w:val="0"/>
-          <w:i w:val="0"/>
-          <w:sz w:val="24"/>
-        </w:rPr>
-        <w:t>6.2.1  本节只适用于设备。设备投入使用前，归属部门按 SMP-QA-000-037 完成系统影响性评估。组件关键性评估按该规程执行，其结论用于设备确认和维护范围的确定。本规程不另设组件分级。</w:t>
-      </w:r>
-    </w:p>
-    <w:p>
-      <w:pPr>
-        <w:spacing w:before="0" w:after="60" w:lineRule="auto" w:line="240"/>
-        <w:ind w:firstLine="0" w:left="0"/>
-        <w:jc w:val="both"/>
-      </w:pPr>
-      <w:r>
-        <w:rPr>
-          <w:rFonts w:ascii="宋体" w:hAnsi="宋体" w:eastAsia="宋体" w:cs="宋体"/>
-          <w:b w:val="0"/>
-          <w:i w:val="0"/>
-          <w:sz w:val="24"/>
-        </w:rPr>
-        <w:t>6.2.2  系统影响性评估结论按表2归入管理类别。</w:t>
+        <w:t>6.1.2  两类设备见下表。表中“如”后为示例。</w:t>
       </w:r>
     </w:p>
     <w:p>
@@ -1996,7 +1610,7 @@
           <w:i w:val="0"/>
           <w:sz w:val="21"/>
         </w:rPr>
-        <w:t>表2  管理类别</w:t>
+        <w:t>表2  设备管理类别</w:t>
       </w:r>
     </w:p>
     <w:tbl>
@@ -2007,9 +1621,8 @@
         <w:tblLook w:firstColumn="1" w:firstRow="1" w:lastColumn="0" w:lastRow="0" w:noHBand="0" w:noVBand="1" w:val="04A0"/>
       </w:tblPr>
       <w:tblGrid>
-        <w:gridCol w:w="3009"/>
-        <w:gridCol w:w="3009"/>
-        <w:gridCol w:w="3009"/>
+        <w:gridCol w:w="4513"/>
+        <w:gridCol w:w="4513"/>
       </w:tblGrid>
       <w:tr>
         <w:trPr>
@@ -2018,7 +1631,7 @@
         </w:trPr>
         <w:tc>
           <w:tcPr>
-            <w:tcW w:type="dxa" w:w="1474"/>
+            <w:tcW w:type="dxa" w:w="1587"/>
             <w:tcBorders>
               <w:top w:val="single" w:sz="4" w:space="0" w:color="000000"/>
               <w:left w:val="single" w:sz="4" w:space="0" w:color="000000"/>
@@ -2042,13 +1655,13 @@
                 <w:i w:val="0"/>
                 <w:sz w:val="21"/>
               </w:rPr>
-              <w:t>管理类别</w:t>
+              <w:t>类别</w:t>
             </w:r>
           </w:p>
         </w:tc>
         <w:tc>
           <w:tcPr>
-            <w:tcW w:type="dxa" w:w="2381"/>
+            <w:tcW w:type="dxa" w:w="7427"/>
             <w:tcBorders>
               <w:top w:val="single" w:sz="4" w:space="0" w:color="000000"/>
               <w:left w:val="single" w:sz="4" w:space="0" w:color="000000"/>
@@ -2072,37 +1685,7 @@
                 <w:i w:val="0"/>
                 <w:sz w:val="21"/>
               </w:rPr>
-              <w:t>评估结论</w:t>
-            </w:r>
-          </w:p>
-        </w:tc>
-        <w:tc>
-          <w:tcPr>
-            <w:tcW w:type="dxa" w:w="5159"/>
-            <w:tcBorders>
-              <w:top w:val="single" w:sz="4" w:space="0" w:color="000000"/>
-              <w:left w:val="single" w:sz="4" w:space="0" w:color="000000"/>
-              <w:bottom w:val="single" w:sz="4" w:space="0" w:color="000000"/>
-              <w:right w:val="single" w:sz="4" w:space="0" w:color="000000"/>
-            </w:tcBorders>
-            <w:shd w:val="clear" w:color="auto" w:fill="D9E2F3"/>
-            <w:vAlign w:val="center"/>
-          </w:tcPr>
-          <w:p>
-            <w:pPr>
-              <w:spacing w:before="20" w:after="20" w:lineRule="auto" w:line="216"/>
-              <w:ind w:firstLine="0" w:left="0"/>
-              <w:jc w:val="center"/>
-            </w:pPr>
-            <w:r/>
-            <w:r>
-              <w:rPr>
-                <w:rFonts w:ascii="宋体" w:hAnsi="宋体" w:eastAsia="宋体" w:cs="宋体"/>
-                <w:b/>
-                <w:i w:val="0"/>
-                <w:sz w:val="21"/>
-              </w:rPr>
-              <w:t>典型示例</w:t>
+              <w:t>评估结论及示例</w:t>
             </w:r>
           </w:p>
         </w:tc>
@@ -2113,7 +1696,7 @@
         </w:trPr>
         <w:tc>
           <w:tcPr>
-            <w:tcW w:type="dxa" w:w="1474"/>
+            <w:tcW w:type="dxa" w:w="1587"/>
             <w:tcBorders>
               <w:top w:val="single" w:sz="4" w:space="0" w:color="000000"/>
               <w:left w:val="single" w:sz="4" w:space="0" w:color="000000"/>
@@ -2143,7 +1726,7 @@
         </w:tc>
         <w:tc>
           <w:tcPr>
-            <w:tcW w:type="dxa" w:w="2381"/>
+            <w:tcW w:type="dxa" w:w="7427"/>
             <w:tcBorders>
               <w:top w:val="single" w:sz="4" w:space="0" w:color="000000"/>
               <w:left w:val="single" w:sz="4" w:space="0" w:color="000000"/>
@@ -2167,37 +1750,7 @@
                 <w:i w:val="0"/>
                 <w:sz w:val="21"/>
               </w:rPr>
-              <w:t>直接影响系统</w:t>
-            </w:r>
-          </w:p>
-        </w:tc>
-        <w:tc>
-          <w:tcPr>
-            <w:tcW w:type="dxa" w:w="5159"/>
-            <w:tcBorders>
-              <w:top w:val="single" w:sz="4" w:space="0" w:color="000000"/>
-              <w:left w:val="single" w:sz="4" w:space="0" w:color="000000"/>
-              <w:bottom w:val="single" w:sz="4" w:space="0" w:color="000000"/>
-              <w:right w:val="single" w:sz="4" w:space="0" w:color="000000"/>
-            </w:tcBorders>
-            <w:shd w:val="clear" w:color="auto" w:fill="FFFFFF"/>
-            <w:vAlign w:val="center"/>
-          </w:tcPr>
-          <w:p>
-            <w:pPr>
-              <w:spacing w:before="20" w:after="20" w:lineRule="auto" w:line="216"/>
-              <w:ind w:firstLine="0" w:left="0"/>
-              <w:jc w:val="left"/>
-            </w:pPr>
-            <w:r/>
-            <w:r>
-              <w:rPr>
-                <w:rFonts w:ascii="宋体" w:hAnsi="宋体" w:eastAsia="宋体" w:cs="宋体"/>
-                <w:b w:val="0"/>
-                <w:i w:val="0"/>
-                <w:sz w:val="21"/>
-              </w:rPr>
-              <w:t>压片机、铝塑包装机、制粒机、空调净化系统、压缩空气系统</w:t>
+              <w:t>直接影响系统，如：压片机、铝塑包装机、制粒机、空调净化系统、压缩空气系统等。</w:t>
             </w:r>
           </w:p>
         </w:tc>
@@ -2208,7 +1761,7 @@
         </w:trPr>
         <w:tc>
           <w:tcPr>
-            <w:tcW w:type="dxa" w:w="1474"/>
+            <w:tcW w:type="dxa" w:w="1587"/>
             <w:tcBorders>
               <w:top w:val="single" w:sz="4" w:space="0" w:color="000000"/>
               <w:left w:val="single" w:sz="4" w:space="0" w:color="000000"/>
@@ -2238,7 +1791,7 @@
         </w:tc>
         <w:tc>
           <w:tcPr>
-            <w:tcW w:type="dxa" w:w="2381"/>
+            <w:tcW w:type="dxa" w:w="7427"/>
             <w:tcBorders>
               <w:top w:val="single" w:sz="4" w:space="0" w:color="000000"/>
               <w:left w:val="single" w:sz="4" w:space="0" w:color="000000"/>
@@ -2262,37 +1815,7 @@
                 <w:i w:val="0"/>
                 <w:sz w:val="21"/>
               </w:rPr>
-              <w:t>非直接影响系统</w:t>
-            </w:r>
-          </w:p>
-        </w:tc>
-        <w:tc>
-          <w:tcPr>
-            <w:tcW w:type="dxa" w:w="5159"/>
-            <w:tcBorders>
-              <w:top w:val="single" w:sz="4" w:space="0" w:color="000000"/>
-              <w:left w:val="single" w:sz="4" w:space="0" w:color="000000"/>
-              <w:bottom w:val="single" w:sz="4" w:space="0" w:color="000000"/>
-              <w:right w:val="single" w:sz="4" w:space="0" w:color="000000"/>
-            </w:tcBorders>
-            <w:shd w:val="clear" w:color="auto" w:fill="FFFFFF"/>
-            <w:vAlign w:val="center"/>
-          </w:tcPr>
-          <w:p>
-            <w:pPr>
-              <w:spacing w:before="20" w:after="20" w:lineRule="auto" w:line="216"/>
-              <w:ind w:firstLine="0" w:left="0"/>
-              <w:jc w:val="left"/>
-            </w:pPr>
-            <w:r/>
-            <w:r>
-              <w:rPr>
-                <w:rFonts w:ascii="宋体" w:hAnsi="宋体" w:eastAsia="宋体" w:cs="宋体"/>
-                <w:b w:val="0"/>
-                <w:i w:val="0"/>
-                <w:sz w:val="21"/>
-              </w:rPr>
-              <w:t>叉车、洗衣机、干衣机</w:t>
+              <w:t>非直接影响系统，如：叉车、洗衣机、干衣机等。</w:t>
             </w:r>
           </w:p>
         </w:tc>
@@ -2311,7 +1834,7 @@
           <w:i w:val="0"/>
           <w:sz w:val="24"/>
         </w:rPr>
-        <w:t>6.2.3  表2中的示例用于帮助理解类别。单台设备的管理类别以该设备的系统影响性评估结论为准。评估结论为直接影响系统的设备按 A 类管理；评估结论为非直接影响系统的设备按 B 类管理。</w:t>
+        <w:t>6.1.3  设备类别记入设备台账。类别确定后不得改变。确需改变设备类别时，按 SMP-QA-000-030《变更控制管理制度》执行。</w:t>
       </w:r>
     </w:p>
     <w:p>
@@ -2327,7 +1850,39 @@
           <w:i w:val="0"/>
           <w:sz w:val="24"/>
         </w:rPr>
-        <w:t>6.2.4  评估结论既不是直接影响系统，也不是非直接影响系统时，归属部门按 SMP-QA-000-037 确定其管理方式，并按 SMP-QA-000-030 批准后再登记管理类别。</w:t>
+        <w:t>6.1.4  本规程不对质量控制部的仪器进行分类。质量控制部仪器的分类由 SMP-QC-000-021 另行管理。质量控制部仪器的编号按第6.3款执行。</w:t>
+      </w:r>
+    </w:p>
+    <w:p>
+      <w:pPr>
+        <w:spacing w:before="120" w:after="80" w:lineRule="auto" w:line="240"/>
+        <w:ind w:firstLine="0" w:left="0"/>
+        <w:jc w:val="left"/>
+      </w:pPr>
+      <w:r>
+        <w:rPr>
+          <w:rFonts w:ascii="宋体" w:hAnsi="宋体" w:eastAsia="宋体" w:cs="宋体"/>
+          <w:b/>
+          <w:i w:val="0"/>
+          <w:sz w:val="24"/>
+        </w:rPr>
+        <w:t>6.2  分类后的管理</w:t>
+      </w:r>
+    </w:p>
+    <w:p>
+      <w:pPr>
+        <w:spacing w:before="40" w:after="60" w:lineRule="auto" w:line="240"/>
+        <w:ind w:firstLine="0" w:left="0"/>
+        <w:jc w:val="both"/>
+      </w:pPr>
+      <w:r>
+        <w:rPr>
+          <w:rFonts w:ascii="宋体" w:hAnsi="宋体" w:eastAsia="宋体" w:cs="宋体"/>
+          <w:b w:val="0"/>
+          <w:i w:val="0"/>
+          <w:sz w:val="24"/>
+        </w:rPr>
+        <w:t>6.2.1  A 类设备</w:t>
       </w:r>
     </w:p>
     <w:p>
@@ -2343,7 +1898,7 @@
           <w:i w:val="0"/>
           <w:sz w:val="24"/>
         </w:rPr>
-        <w:t>6.2.5  管理类别登记后保持不变。需要改变类别时，归属部门重新进行系统影响性评估，并按 SMP-QA-000-030 批准。变更批准前，设备继续按原类别管理。</w:t>
+        <w:t>6.2.1.1  A 类设备由归属部门负责组织操作规程、清洁规程和维护规程的起草、修订和审核，并对相关人员进行培训。</w:t>
       </w:r>
     </w:p>
     <w:p>
@@ -2359,7 +1914,103 @@
           <w:i w:val="0"/>
           <w:sz w:val="24"/>
         </w:rPr>
-        <w:t>6.2.6  仪器不按本节分类。质量控制部仪器的分类执行 SMP-QC-000-021。其他仪器的分类执行其适用的管理规程。</w:t>
+        <w:t>6.2.1.2  A 类设备的归属部门应当指定设备负责人。设备负责人离职或调岗时，应当与继任者完成交接。交接内容至少包括：设备使用记录、维护保养记录、操作规程、维护规程、清洁规程、备品备件、设备运行情况及注意事项。</w:t>
+      </w:r>
+    </w:p>
+    <w:p>
+      <w:pPr>
+        <w:spacing w:before="0" w:after="60" w:lineRule="auto" w:line="240"/>
+        <w:ind w:firstLine="0" w:left="0"/>
+        <w:jc w:val="both"/>
+      </w:pPr>
+      <w:r>
+        <w:rPr>
+          <w:rFonts w:ascii="宋体" w:hAnsi="宋体" w:eastAsia="宋体" w:cs="宋体"/>
+          <w:b w:val="0"/>
+          <w:i w:val="0"/>
+          <w:sz w:val="24"/>
+        </w:rPr>
+        <w:t>6.2.1.3  A 类设备应当建立相应的使用记录，如实记录设备运行情况。</w:t>
+      </w:r>
+    </w:p>
+    <w:p>
+      <w:pPr>
+        <w:spacing w:before="80" w:after="60" w:lineRule="auto" w:line="240"/>
+        <w:ind w:firstLine="0" w:left="0"/>
+        <w:jc w:val="both"/>
+      </w:pPr>
+      <w:r>
+        <w:rPr>
+          <w:rFonts w:ascii="宋体" w:hAnsi="宋体" w:eastAsia="宋体" w:cs="宋体"/>
+          <w:b w:val="0"/>
+          <w:i w:val="0"/>
+          <w:sz w:val="24"/>
+        </w:rPr>
+        <w:t>6.2.2  B 类设备</w:t>
+      </w:r>
+    </w:p>
+    <w:p>
+      <w:pPr>
+        <w:spacing w:before="0" w:after="60" w:lineRule="auto" w:line="240"/>
+        <w:ind w:firstLine="0" w:left="0"/>
+        <w:jc w:val="both"/>
+      </w:pPr>
+      <w:r>
+        <w:rPr>
+          <w:rFonts w:ascii="宋体" w:hAnsi="宋体" w:eastAsia="宋体" w:cs="宋体"/>
+          <w:b w:val="0"/>
+          <w:i w:val="0"/>
+          <w:sz w:val="24"/>
+        </w:rPr>
+        <w:t>6.2.2.1  归属部门应当根据 B 类设备的结构复杂程度和设备说明书的要求，组织操作规程、清洁规程和维护规程的起草、修订和审核，并确保相关操作人员、维护人员经培训合格后方可上岗。</w:t>
+      </w:r>
+    </w:p>
+    <w:p>
+      <w:pPr>
+        <w:spacing w:before="0" w:after="60" w:lineRule="auto" w:line="240"/>
+        <w:ind w:firstLine="0" w:left="0"/>
+        <w:jc w:val="both"/>
+      </w:pPr>
+      <w:r>
+        <w:rPr>
+          <w:rFonts w:ascii="宋体" w:hAnsi="宋体" w:eastAsia="宋体" w:cs="宋体"/>
+          <w:b w:val="0"/>
+          <w:i w:val="0"/>
+          <w:sz w:val="24"/>
+        </w:rPr>
+        <w:t>6.2.2.2  结构简单、操作及维护要求明确的 B 类设备，可以将操作规程、清洁规程和维护规程合并为一份操作维护清洁规程。合并后仍应当确保使用、清洁和维护要求完整、清晰、可执行。</w:t>
+      </w:r>
+    </w:p>
+    <w:p>
+      <w:pPr>
+        <w:spacing w:before="80" w:after="60" w:lineRule="auto" w:line="240"/>
+        <w:ind w:firstLine="0" w:left="0"/>
+        <w:jc w:val="both"/>
+      </w:pPr>
+      <w:r>
+        <w:rPr>
+          <w:rFonts w:ascii="宋体" w:hAnsi="宋体" w:eastAsia="宋体" w:cs="宋体"/>
+          <w:b w:val="0"/>
+          <w:i w:val="0"/>
+          <w:sz w:val="24"/>
+        </w:rPr>
+        <w:t>6.2.3  设备确认按照 SMP-VP-000-004《设施、设备确认管理规程》执行。</w:t>
+      </w:r>
+    </w:p>
+    <w:p>
+      <w:pPr>
+        <w:spacing w:before="0" w:after="60" w:lineRule="auto" w:line="240"/>
+        <w:ind w:firstLine="0" w:left="0"/>
+        <w:jc w:val="both"/>
+      </w:pPr>
+      <w:r>
+        <w:rPr>
+          <w:rFonts w:ascii="宋体" w:hAnsi="宋体" w:eastAsia="宋体" w:cs="宋体"/>
+          <w:b w:val="0"/>
+          <w:i w:val="0"/>
+          <w:sz w:val="24"/>
+        </w:rPr>
+        <w:t>6.2.4  设备维修、预防性维护按照 SMP-EQ-100-004《设备设施故障报告与维修管理规程》和 SMP-EQ-100-003《设备预防性维护、维修管理规程》执行。</w:t>
       </w:r>
     </w:p>
     <w:p>
@@ -2375,7 +2026,7 @@
           <w:i w:val="0"/>
           <w:sz w:val="24"/>
         </w:rPr>
-        <w:t>6.3  分类管理要求</w:t>
+        <w:t>6.3  设备、仪器编号</w:t>
       </w:r>
     </w:p>
     <w:p>
@@ -2391,7 +2042,7 @@
           <w:i w:val="0"/>
           <w:sz w:val="24"/>
         </w:rPr>
-        <w:t>6.3.1  本节只适用于设备。仪器不执行本节，只执行第6.4款至第6.8款。</w:t>
+        <w:t>6.3.1  设备、仪器的一级编号由三段依次连接，段间不插入空格或其他符号：设备大类代号、部门代号、三位流水号。</w:t>
       </w:r>
     </w:p>
     <w:p>
@@ -2407,7 +2058,7 @@
           <w:i w:val="0"/>
           <w:sz w:val="24"/>
         </w:rPr>
-        <w:t>6.3.2  归属部门在设备投入使用前完成与其管理类别相适应的规程批准，并对操作人员和维护人员进行培训。培训合格后，人员方可独立操作或维护该设备。</w:t>
+        <w:t>6.3.2  某台设备的辅助设备或附属装置需要编制二级编号时，在该设备的一级编号后加半角连字符“-”和两位序号。二级编号不另取设备大类代号。</w:t>
       </w:r>
     </w:p>
     <w:p>
@@ -2423,7 +2074,7 @@
           <w:i w:val="0"/>
           <w:sz w:val="24"/>
         </w:rPr>
-        <w:t>6.3.3  用于药品生产的设备应当建立使用日志。使用日志至少包括使用、清洁、维护和维修情况以及日期、时间、所生产药品的名称、规格和批号等。直接用于某一批产品生产的设备，使用日志应当记录该药品的名称、规格和批号。多个批次共用的公用系统，使用日志应当记录运行、清洁、维护、维修以及日期和时间，并使批记录能够追溯到该系统相应时间的运行记录。</w:t>
+        <w:t>6.3.3  大类代号 F 表示按一级编号单独编制的辅助设备。附属于某台已编号设备、并按第6.3.2款编制二级编号的辅助设备或附属装置，使用主设备编号加序号，不使用大类代号 F。</w:t>
       </w:r>
     </w:p>
     <w:p>
@@ -2439,311 +2090,7 @@
           <w:i w:val="0"/>
           <w:sz w:val="24"/>
         </w:rPr>
-        <w:t>6.3.4  不用于药品生产的 B 类设备，由归属部门保存与其实际使用、清洁和维护相适应的记录。</w:t>
-      </w:r>
-    </w:p>
-    <w:p>
-      <w:pPr>
-        <w:spacing w:before="0" w:after="60" w:lineRule="auto" w:line="240"/>
-        <w:ind w:firstLine="0" w:left="0"/>
-        <w:jc w:val="both"/>
-      </w:pPr>
-      <w:r>
-        <w:rPr>
-          <w:rFonts w:ascii="宋体" w:hAnsi="宋体" w:eastAsia="宋体" w:cs="宋体"/>
-          <w:b w:val="0"/>
-          <w:i w:val="0"/>
-          <w:sz w:val="24"/>
-        </w:rPr>
-        <w:t>6.3.5  生产设备的状态标识应当标明设备编号。有内容物时，还应当标明内容物的名称、规格和批号；无内容物时，应当标明清洁状态。不合格设备在移出生产区或质量控制区之前，应当有醒目的状态标识。</w:t>
-      </w:r>
-    </w:p>
-    <w:p>
-      <w:pPr>
-        <w:spacing w:before="0" w:after="60" w:lineRule="auto" w:line="240"/>
-        <w:ind w:firstLine="0" w:left="0"/>
-        <w:jc w:val="both"/>
-      </w:pPr>
-      <w:r>
-        <w:rPr>
-          <w:rFonts w:ascii="宋体" w:hAnsi="宋体" w:eastAsia="宋体" w:cs="宋体"/>
-          <w:b w:val="0"/>
-          <w:i w:val="0"/>
-          <w:sz w:val="24"/>
-        </w:rPr>
-        <w:t>6.3.6  A 类设备由归属部门分别组织操作规程、清洁规程和维护规程的起草、修订和审核，并对相关人员进行培训。A 类设备建立第6.3.3款规定的使用日志，如实记录设备运行情况。</w:t>
-      </w:r>
-    </w:p>
-    <w:p>
-      <w:pPr>
-        <w:spacing w:before="0" w:after="60" w:lineRule="auto" w:line="240"/>
-        <w:ind w:firstLine="0" w:left="0"/>
-        <w:jc w:val="both"/>
-      </w:pPr>
-      <w:r>
-        <w:rPr>
-          <w:rFonts w:ascii="宋体" w:hAnsi="宋体" w:eastAsia="宋体" w:cs="宋体"/>
-          <w:b w:val="0"/>
-          <w:i w:val="0"/>
-          <w:sz w:val="24"/>
-        </w:rPr>
-        <w:t>6.3.7  A 类设备由归属部门指定设备负责人。设备负责人离职或调岗时，应当与继任者完成交接。交接内容至少包括使用日志、维护保养记录、操作规程、维护规程、清洁规程、备品备件、设备运行情况及注意事项。交接记录由双方签署姓名和日期，并纳入设备档案。</w:t>
-      </w:r>
-    </w:p>
-    <w:p>
-      <w:pPr>
-        <w:spacing w:before="0" w:after="60" w:lineRule="auto" w:line="240"/>
-        <w:ind w:firstLine="0" w:left="0"/>
-        <w:jc w:val="both"/>
-      </w:pPr>
-      <w:r>
-        <w:rPr>
-          <w:rFonts w:ascii="宋体" w:hAnsi="宋体" w:eastAsia="宋体" w:cs="宋体"/>
-          <w:b w:val="0"/>
-          <w:i w:val="0"/>
-          <w:sz w:val="24"/>
-        </w:rPr>
-        <w:t>6.3.8  B 类设备由归属部门根据设备的结构复杂程度和设备说明书，组织操作规程、清洁规程和维护规程的起草、修订和审核。操作人员和维护人员经培训合格后方可上岗。</w:t>
-      </w:r>
-    </w:p>
-    <w:p>
-      <w:pPr>
-        <w:spacing w:before="0" w:after="60" w:lineRule="auto" w:line="240"/>
-        <w:ind w:firstLine="0" w:left="0"/>
-        <w:jc w:val="both"/>
-      </w:pPr>
-      <w:r>
-        <w:rPr>
-          <w:rFonts w:ascii="宋体" w:hAnsi="宋体" w:eastAsia="宋体" w:cs="宋体"/>
-          <w:b w:val="0"/>
-          <w:i w:val="0"/>
-          <w:sz w:val="24"/>
-        </w:rPr>
-        <w:t>6.3.9  结构简单、操作和维护要求明确的 B 类设备，可以将操作规程、清洁规程和维护规程合并为一份《操作维护清洁规程》。合并后的规程应当完整、清晰、可执行，并包含使用、清洁和维护要求。</w:t>
-      </w:r>
-    </w:p>
-    <w:p>
-      <w:pPr>
-        <w:spacing w:before="0" w:after="60" w:lineRule="auto" w:line="240"/>
-        <w:ind w:firstLine="0" w:left="0"/>
-        <w:jc w:val="both"/>
-      </w:pPr>
-      <w:r>
-        <w:rPr>
-          <w:rFonts w:ascii="宋体" w:hAnsi="宋体" w:eastAsia="宋体" w:cs="宋体"/>
-          <w:b w:val="0"/>
-          <w:i w:val="0"/>
-          <w:sz w:val="24"/>
-        </w:rPr>
-        <w:t>6.3.10  设备确认的对象、方案和实施执行 SMP-VP-000-004。系统影响性评估结论作为确定确认范围的输入。已完成确认的生产设备，应当在确认的参数范围内使用。设备经改造或重大维修后，应当完成再确认并符合要求，方可恢复用于生产。</w:t>
-      </w:r>
-    </w:p>
-    <w:p>
-      <w:pPr>
-        <w:spacing w:before="0" w:after="60" w:lineRule="auto" w:line="240"/>
-        <w:ind w:firstLine="0" w:left="0"/>
-        <w:jc w:val="both"/>
-      </w:pPr>
-      <w:r>
-        <w:rPr>
-          <w:rFonts w:ascii="宋体" w:hAnsi="宋体" w:eastAsia="宋体" w:cs="宋体"/>
-          <w:b w:val="0"/>
-          <w:i w:val="0"/>
-          <w:sz w:val="24"/>
-        </w:rPr>
-        <w:t>6.3.11  预防性维护执行 SMP-EQ-100-003。故障报告与维修执行 SMP-EQ-100-004。设备的维护和维修记录使用本规程规定的设备编号。</w:t>
-      </w:r>
-    </w:p>
-    <w:p>
-      <w:pPr>
-        <w:spacing w:before="120" w:after="80" w:lineRule="auto" w:line="240"/>
-        <w:ind w:firstLine="0" w:left="0"/>
-        <w:jc w:val="left"/>
-      </w:pPr>
-      <w:r>
-        <w:rPr>
-          <w:rFonts w:ascii="宋体" w:hAnsi="宋体" w:eastAsia="宋体" w:cs="宋体"/>
-          <w:b/>
-          <w:i w:val="0"/>
-          <w:sz w:val="24"/>
-        </w:rPr>
-        <w:t>6.4  编号规则</w:t>
-      </w:r>
-    </w:p>
-    <w:p>
-      <w:pPr>
-        <w:spacing w:before="0" w:after="60" w:lineRule="auto" w:line="240"/>
-        <w:ind w:firstLine="0" w:left="0"/>
-        <w:jc w:val="both"/>
-      </w:pPr>
-      <w:r>
-        <w:rPr>
-          <w:rFonts w:ascii="宋体" w:hAnsi="宋体" w:eastAsia="宋体" w:cs="宋体"/>
-          <w:b w:val="0"/>
-          <w:i w:val="0"/>
-          <w:sz w:val="24"/>
-        </w:rPr>
-        <w:t>6.4.1  一级编号由以下三段依次连接，段与段之间不插入空格或其他分隔符：</w:t>
-      </w:r>
-    </w:p>
-    <w:p>
-      <w:pPr>
-        <w:spacing w:before="0" w:after="60" w:lineRule="auto" w:line="240"/>
-        <w:ind w:firstLine="0" w:left="0"/>
-        <w:jc w:val="both"/>
-      </w:pPr>
-      <w:r>
-        <w:rPr>
-          <w:rFonts w:ascii="宋体" w:hAnsi="宋体" w:eastAsia="宋体" w:cs="宋体"/>
-          <w:b w:val="0"/>
-          <w:i w:val="0"/>
-          <w:sz w:val="24"/>
-        </w:rPr>
-        <w:t>（1）设备大类代号；</w:t>
-      </w:r>
-    </w:p>
-    <w:p>
-      <w:pPr>
-        <w:spacing w:before="0" w:after="60" w:lineRule="auto" w:line="240"/>
-        <w:ind w:firstLine="0" w:left="0"/>
-        <w:jc w:val="both"/>
-      </w:pPr>
-      <w:r>
-        <w:rPr>
-          <w:rFonts w:ascii="宋体" w:hAnsi="宋体" w:eastAsia="宋体" w:cs="宋体"/>
-          <w:b w:val="0"/>
-          <w:i w:val="0"/>
-          <w:sz w:val="24"/>
-        </w:rPr>
-        <w:t>（2）部门代号；</w:t>
-      </w:r>
-    </w:p>
-    <w:p>
-      <w:pPr>
-        <w:spacing w:before="0" w:after="60" w:lineRule="auto" w:line="240"/>
-        <w:ind w:firstLine="0" w:left="0"/>
-        <w:jc w:val="both"/>
-      </w:pPr>
-      <w:r>
-        <w:rPr>
-          <w:rFonts w:ascii="宋体" w:hAnsi="宋体" w:eastAsia="宋体" w:cs="宋体"/>
-          <w:b w:val="0"/>
-          <w:i w:val="0"/>
-          <w:sz w:val="24"/>
-        </w:rPr>
-        <w:t>（3）三位流水号。</w:t>
-      </w:r>
-    </w:p>
-    <w:p>
-      <w:pPr>
-        <w:spacing w:before="0" w:after="60" w:lineRule="auto" w:line="240"/>
-        <w:ind w:firstLine="0" w:left="0"/>
-        <w:jc w:val="both"/>
-      </w:pPr>
-      <w:r>
-        <w:rPr>
-          <w:rFonts w:ascii="宋体" w:hAnsi="宋体" w:eastAsia="宋体" w:cs="宋体"/>
-          <w:b w:val="0"/>
-          <w:i w:val="0"/>
-          <w:sz w:val="24"/>
-        </w:rPr>
-        <w:t>S1、S2 各占两个字符，其余大类代号占一个字符。部门代号占一个字符。一级编号因此为五个字符或六个字符。</w:t>
-      </w:r>
-    </w:p>
-    <w:p>
-      <w:pPr>
-        <w:spacing w:before="0" w:after="60" w:lineRule="auto" w:line="240"/>
-        <w:ind w:firstLine="0" w:left="0"/>
-        <w:jc w:val="both"/>
-      </w:pPr>
-      <w:r>
-        <w:rPr>
-          <w:rFonts w:ascii="宋体" w:hAnsi="宋体" w:eastAsia="宋体" w:cs="宋体"/>
-          <w:b w:val="0"/>
-          <w:i w:val="0"/>
-          <w:sz w:val="24"/>
-        </w:rPr>
-        <w:t>6.4.2  二级编号由主设备的一级编号、半角连字符“-”和两位附属装置序号依次连接组成。</w:t>
-      </w:r>
-    </w:p>
-    <w:p>
-      <w:pPr>
-        <w:spacing w:before="0" w:after="60" w:lineRule="auto" w:line="240"/>
-        <w:ind w:firstLine="0" w:left="0"/>
-        <w:jc w:val="both"/>
-      </w:pPr>
-      <w:r>
-        <w:rPr>
-          <w:rFonts w:ascii="宋体" w:hAnsi="宋体" w:eastAsia="宋体" w:cs="宋体"/>
-          <w:b w:val="0"/>
-          <w:i w:val="0"/>
-          <w:sz w:val="24"/>
-        </w:rPr>
-        <w:t>6.4.3  固定服务于一台主设备、并随该主设备一并管理的附属装置，使用二级编号。可以独立使用，或同时服务于多台主设备的辅助设备，使用大类 F 的一级编号。</w:t>
-      </w:r>
-    </w:p>
-    <w:p>
-      <w:pPr>
-        <w:spacing w:before="0" w:after="60" w:lineRule="auto" w:line="240"/>
-        <w:ind w:firstLine="0" w:left="0"/>
-        <w:jc w:val="both"/>
-      </w:pPr>
-      <w:r>
-        <w:rPr>
-          <w:rFonts w:ascii="宋体" w:hAnsi="宋体" w:eastAsia="宋体" w:cs="宋体"/>
-          <w:b w:val="0"/>
-          <w:i w:val="0"/>
-          <w:sz w:val="24"/>
-        </w:rPr>
-        <w:t>6.4.4  流水号在同一大类代号与同一部门代号的组合内从 001 起按发放顺序编制。附属装置序号在同一主设备下从 01 起按发放顺序编制。已配发的号码取消使用后，不再配发给其他设备；台账中可以保留空号。</w:t>
-      </w:r>
-    </w:p>
-    <w:p>
-      <w:pPr>
-        <w:spacing w:before="0" w:after="60" w:lineRule="auto" w:line="240"/>
-        <w:ind w:firstLine="0" w:left="0"/>
-        <w:jc w:val="both"/>
-      </w:pPr>
-      <w:r>
-        <w:rPr>
-          <w:rFonts w:ascii="宋体" w:hAnsi="宋体" w:eastAsia="宋体" w:cs="宋体"/>
-          <w:b w:val="0"/>
-          <w:i w:val="0"/>
-          <w:sz w:val="24"/>
-        </w:rPr>
-        <w:t>6.4.5  编号中的字母使用大写。台账、现场标识、记录和电子系统统一使用 S1、S2。</w:t>
-      </w:r>
-    </w:p>
-    <w:p>
-      <w:pPr>
-        <w:spacing w:before="120" w:after="80" w:lineRule="auto" w:line="240"/>
-        <w:ind w:firstLine="0" w:left="0"/>
-        <w:jc w:val="left"/>
-      </w:pPr>
-      <w:r>
-        <w:rPr>
-          <w:rFonts w:ascii="宋体" w:hAnsi="宋体" w:eastAsia="宋体" w:cs="宋体"/>
-          <w:b/>
-          <w:i w:val="0"/>
-          <w:sz w:val="24"/>
-        </w:rPr>
-        <w:t>6.5  代号</w:t>
-      </w:r>
-    </w:p>
-    <w:p>
-      <w:pPr>
-        <w:spacing w:before="0" w:after="60" w:lineRule="auto" w:line="240"/>
-        <w:ind w:firstLine="0" w:left="0"/>
-        <w:jc w:val="both"/>
-      </w:pPr>
-      <w:r>
-        <w:rPr>
-          <w:rFonts w:ascii="宋体" w:hAnsi="宋体" w:eastAsia="宋体" w:cs="宋体"/>
-          <w:b w:val="0"/>
-          <w:i w:val="0"/>
-          <w:sz w:val="24"/>
-        </w:rPr>
-        <w:t>6.5.1  设备大类代号按表3使用。</w:t>
+        <w:t>6.3.4  设备大类代号按表3使用。S1、S2 在编号中按表内写法书写。</w:t>
       </w:r>
     </w:p>
     <w:p>
@@ -3086,7 +2433,7 @@
                 <w:i w:val="0"/>
                 <w:sz w:val="21"/>
               </w:rPr>
-              <w:t>辅助设备（独立辅助设备）</w:t>
+              <w:t>辅助设备</w:t>
             </w:r>
           </w:p>
         </w:tc>
@@ -3211,7 +2558,7 @@
                 <w:i w:val="0"/>
                 <w:sz w:val="21"/>
               </w:rPr>
-              <w:t>办公及其他设备</w:t>
+              <w:t>办公及其它设备</w:t>
             </w:r>
           </w:p>
         </w:tc>
@@ -3290,7 +2637,7 @@
           <w:i w:val="0"/>
           <w:sz w:val="24"/>
         </w:rPr>
-        <w:t>6.5.2  部门代号按表4使用。</w:t>
+        <w:t>6.3.5  部门代号按表4使用。</w:t>
       </w:r>
     </w:p>
     <w:p>
@@ -3943,7 +3290,7 @@
                 <w:i w:val="0"/>
                 <w:sz w:val="21"/>
               </w:rPr>
-              <w:t>其他</w:t>
+              <w:t>其它</w:t>
             </w:r>
           </w:p>
         </w:tc>
@@ -3962,7 +3309,7 @@
           <w:i w:val="0"/>
           <w:sz w:val="24"/>
         </w:rPr>
-        <w:t>6.5.3  原料药车间的生产设备使用大类 S1，口服固体制剂车间的生产设备使用大类 S2。部门代号按设备实际所在车间或部门从表4选取。设备位于 301 车间或 302 车间时，部门代号为 B；位于 401 车间时，部门代号为 C。</w:t>
+        <w:t>6.3.6  流水号为三位阿拉伯数字，自 001 起按顺序编制。辅助设备或附属装置的序号为两位阿拉伯数字，自 01 起按顺序编制。</w:t>
       </w:r>
     </w:p>
     <w:p>
@@ -3978,7 +3325,7 @@
           <w:i w:val="0"/>
           <w:sz w:val="24"/>
         </w:rPr>
-        <w:t>6.5.4  部门代号 B 同时代表 301 车间和 302 车间。这两个车间在同一大类下共用一个流水号序列，按第6.4.4款连续配号。</w:t>
+        <w:t>6.3.7  301 车间和 302 车间的部门代号均为 B。同一设备大类下，这两个车间共用一个流水号序列，以保证完整编号唯一。</w:t>
       </w:r>
     </w:p>
     <w:p>
@@ -3994,7 +3341,7 @@
           <w:i w:val="0"/>
           <w:sz w:val="24"/>
         </w:rPr>
-        <w:t>6.5.5  大类代号 F 与部门代号 F 字母相同，按“大类在前、部门在后”识读。例如 FF001 表示物料部的一台独立辅助设备，其流水号为 001。</w:t>
+        <w:t>6.3.8  以 401 车间全自动胶囊填充机为例。该设备的大类为口服固体制剂车间生产设备，部门为 401 车间。假设流水号为 009，则编号为 S2C009。其中 S2 为设备大类，C 为部门代号，009 为流水号。</w:t>
       </w:r>
     </w:p>
     <w:p>
@@ -4010,295 +3357,7 @@
           <w:i w:val="0"/>
           <w:sz w:val="24"/>
         </w:rPr>
-        <w:t>6.5.6  大类 Q 表示办公及其他设备。部门代号 H 表示表4所列部门以外的部门。使用 H 时，设备台账应当写明实际部门名称。新增部门代号或大类代号前，先按 SMP-QA-000-030 修订本规程的代码表，再按新代号配号。</w:t>
-      </w:r>
-    </w:p>
-    <w:p>
-      <w:pPr>
-        <w:spacing w:before="0" w:after="60" w:lineRule="auto" w:line="240"/>
-        <w:ind w:firstLine="0" w:left="0"/>
-        <w:jc w:val="both"/>
-      </w:pPr>
-      <w:r>
-        <w:rPr>
-          <w:rFonts w:ascii="宋体" w:hAnsi="宋体" w:eastAsia="宋体" w:cs="宋体"/>
-          <w:b w:val="0"/>
-          <w:i w:val="0"/>
-          <w:sz w:val="24"/>
-        </w:rPr>
-        <w:t>6.5.7  空调净化系统、压缩空气系统等公用系统的大类代号，按该系统在台账中的归属选用 S1、S2 或其他已列代号。其管理类别按该系统的系统影响性评估结论登记为 A 类或 B 类。</w:t>
-      </w:r>
-    </w:p>
-    <w:p>
-      <w:pPr>
-        <w:spacing w:before="0" w:after="60" w:lineRule="auto" w:line="240"/>
-        <w:ind w:firstLine="0" w:left="0"/>
-        <w:jc w:val="both"/>
-      </w:pPr>
-      <w:r>
-        <w:rPr>
-          <w:rFonts w:ascii="宋体" w:hAnsi="宋体" w:eastAsia="宋体" w:cs="宋体"/>
-          <w:b w:val="0"/>
-          <w:i w:val="0"/>
-          <w:sz w:val="24"/>
-        </w:rPr>
-        <w:t>6.5.8  检测仪器使用大类 J，部门代号按其实际归属选取。质量控制部的检测仪器，部门代号为 E。</w:t>
-      </w:r>
-    </w:p>
-    <w:p>
-      <w:pPr>
-        <w:spacing w:before="120" w:after="80" w:lineRule="auto" w:line="240"/>
-        <w:ind w:firstLine="0" w:left="0"/>
-        <w:jc w:val="left"/>
-      </w:pPr>
-      <w:r>
-        <w:rPr>
-          <w:rFonts w:ascii="宋体" w:hAnsi="宋体" w:eastAsia="宋体" w:cs="宋体"/>
-          <w:b/>
-          <w:i w:val="0"/>
-          <w:sz w:val="24"/>
-        </w:rPr>
-        <w:t>6.6  编号的建立、使用、变更和注销</w:t>
-      </w:r>
-    </w:p>
-    <w:p>
-      <w:pPr>
-        <w:spacing w:before="0" w:after="60" w:lineRule="auto" w:line="240"/>
-        <w:ind w:firstLine="0" w:left="0"/>
-        <w:jc w:val="both"/>
-      </w:pPr>
-      <w:r>
-        <w:rPr>
-          <w:rFonts w:ascii="宋体" w:hAnsi="宋体" w:eastAsia="宋体" w:cs="宋体"/>
-          <w:b w:val="0"/>
-          <w:i w:val="0"/>
-          <w:sz w:val="24"/>
-        </w:rPr>
-        <w:t>6.6.1  设备归属部门在设备建账时，应当向设备工程部提供设备名称、型号、出厂编号、使用地点、建议的大类代号和部门代号，以及系统影响性评估结论或评估编号。附属装置同时提供主设备的现行编号。仪器所在部门只提供仪器名称、型号、出厂编号、安装地点和建议的大类代号、部门代号，不提供 A 类或 B 类结论。</w:t>
-      </w:r>
-    </w:p>
-    <w:p>
-      <w:pPr>
-        <w:spacing w:before="0" w:after="60" w:lineRule="auto" w:line="240"/>
-        <w:ind w:firstLine="0" w:left="0"/>
-        <w:jc w:val="both"/>
-      </w:pPr>
-      <w:r>
-        <w:rPr>
-          <w:rFonts w:ascii="宋体" w:hAnsi="宋体" w:eastAsia="宋体" w:cs="宋体"/>
-          <w:b w:val="0"/>
-          <w:i w:val="0"/>
-          <w:sz w:val="24"/>
-        </w:rPr>
-        <w:t>6.6.2  设备工程部应当核对代号和已发放的流水号，并将编号写入设备台账。编号自写入台账之日起启用。</w:t>
-      </w:r>
-    </w:p>
-    <w:p>
-      <w:pPr>
-        <w:spacing w:before="0" w:after="60" w:lineRule="auto" w:line="240"/>
-        <w:ind w:firstLine="0" w:left="0"/>
-        <w:jc w:val="both"/>
-      </w:pPr>
-      <w:r>
-        <w:rPr>
-          <w:rFonts w:ascii="宋体" w:hAnsi="宋体" w:eastAsia="宋体" w:cs="宋体"/>
-          <w:b w:val="0"/>
-          <w:i w:val="0"/>
-          <w:sz w:val="24"/>
-        </w:rPr>
-        <w:t>6.6.3  设备的现场标识、使用日志、维护维修记录和确认记录应当使用该设备的现行编号。仪器的现场编号使用本规程配发的编号。仪器的使用、校准和维护记录执行其适用规程，并引用同一编号。</w:t>
-      </w:r>
-    </w:p>
-    <w:p>
-      <w:pPr>
-        <w:spacing w:before="0" w:after="60" w:lineRule="auto" w:line="240"/>
-        <w:ind w:firstLine="0" w:left="0"/>
-        <w:jc w:val="both"/>
-      </w:pPr>
-      <w:r>
-        <w:rPr>
-          <w:rFonts w:ascii="宋体" w:hAnsi="宋体" w:eastAsia="宋体" w:cs="宋体"/>
-          <w:b w:val="0"/>
-          <w:i w:val="0"/>
-          <w:sz w:val="24"/>
-        </w:rPr>
-        <w:t>6.6.4  大类代号、部门代号或主从关系发生变化，因而需要改变编号时，按 SMP-QA-000-030 办理。变更批准后，设备工程部配发新编号。设备台账保留原编号、新编号、变更原因和生效日期。变更前已经形成的记录保持原编号。</w:t>
-      </w:r>
-    </w:p>
-    <w:p>
-      <w:pPr>
-        <w:spacing w:before="0" w:after="60" w:lineRule="auto" w:line="240"/>
-        <w:ind w:firstLine="0" w:left="0"/>
-        <w:jc w:val="both"/>
-      </w:pPr>
-      <w:r>
-        <w:rPr>
-          <w:rFonts w:ascii="宋体" w:hAnsi="宋体" w:eastAsia="宋体" w:cs="宋体"/>
-          <w:b w:val="0"/>
-          <w:i w:val="0"/>
-          <w:sz w:val="24"/>
-        </w:rPr>
-        <w:t>6.6.5  安装地点发生变化，而大类代号、部门代号和主从关系保持不变时，继续使用原编号，并在设备台账中更新安装地点。301 车间与 302 车间之间调动设备时，部门代号仍为 B，编号不变。</w:t>
-      </w:r>
-    </w:p>
-    <w:p>
-      <w:pPr>
-        <w:spacing w:before="0" w:after="60" w:lineRule="auto" w:line="240"/>
-        <w:ind w:firstLine="0" w:left="0"/>
-        <w:jc w:val="both"/>
-      </w:pPr>
-      <w:r>
-        <w:rPr>
-          <w:rFonts w:ascii="宋体" w:hAnsi="宋体" w:eastAsia="宋体" w:cs="宋体"/>
-          <w:b w:val="0"/>
-          <w:i w:val="0"/>
-          <w:sz w:val="24"/>
-        </w:rPr>
-        <w:t>6.6.6  设备或仪器报废、调出或不再纳入本公司管理时，设备工程部在台账中注销其在用状态，并按第6.1.3款冻结编号。</w:t>
-      </w:r>
-    </w:p>
-    <w:p>
-      <w:pPr>
-        <w:spacing w:before="0" w:after="60" w:lineRule="auto" w:line="240"/>
-        <w:ind w:firstLine="0" w:left="0"/>
-        <w:jc w:val="both"/>
-      </w:pPr>
-      <w:r>
-        <w:rPr>
-          <w:rFonts w:ascii="宋体" w:hAnsi="宋体" w:eastAsia="宋体" w:cs="宋体"/>
-          <w:b w:val="0"/>
-          <w:i w:val="0"/>
-          <w:sz w:val="24"/>
-        </w:rPr>
-        <w:t>6.6.7  本规程生效前已经发放、并且仍在使用的编号继续有效。发现历史编号与第6.4款或第6.5.4款不一致时，设备工程部在台账中登记差异；需要改号时按第6.6.4款办理。改号批准前继续使用原编号。历史编号使用下标 S₁、S₂ 的，在更换现场标识或整理台账时统一写为 S1、S2，并在台账中保留两种写法的对应关系。这种统一写法不视为重新编号，不冻结原编号。</w:t>
-      </w:r>
-    </w:p>
-    <w:p>
-      <w:pPr>
-        <w:spacing w:before="120" w:after="80" w:lineRule="auto" w:line="240"/>
-        <w:ind w:firstLine="0" w:left="0"/>
-        <w:jc w:val="left"/>
-      </w:pPr>
-      <w:r>
-        <w:rPr>
-          <w:rFonts w:ascii="宋体" w:hAnsi="宋体" w:eastAsia="宋体" w:cs="宋体"/>
-          <w:b/>
-          <w:i w:val="0"/>
-          <w:sz w:val="24"/>
-        </w:rPr>
-        <w:t>6.7  设备台账</w:t>
-      </w:r>
-    </w:p>
-    <w:p>
-      <w:pPr>
-        <w:spacing w:before="0" w:after="60" w:lineRule="auto" w:line="240"/>
-        <w:ind w:firstLine="0" w:left="0"/>
-        <w:jc w:val="both"/>
-      </w:pPr>
-      <w:r>
-        <w:rPr>
-          <w:rFonts w:ascii="宋体" w:hAnsi="宋体" w:eastAsia="宋体" w:cs="宋体"/>
-          <w:b w:val="0"/>
-          <w:i w:val="0"/>
-          <w:sz w:val="24"/>
-        </w:rPr>
-        <w:t>6.7.1  设备工程部在设备台账中登记设备的现行编号，并使设备条目至少能够追溯下列信息：曾用编号、设备名称、型号、出厂编号、归属部门、安装地点、大类代号、管理类别、系统影响性评估编号、主设备编号（仅附属装置填写）、状态和启用日期。</w:t>
-      </w:r>
-    </w:p>
-    <w:p>
-      <w:pPr>
-        <w:spacing w:before="0" w:after="60" w:lineRule="auto" w:line="240"/>
-        <w:ind w:firstLine="0" w:left="0"/>
-        <w:jc w:val="both"/>
-      </w:pPr>
-      <w:r>
-        <w:rPr>
-          <w:rFonts w:ascii="宋体" w:hAnsi="宋体" w:eastAsia="宋体" w:cs="宋体"/>
-          <w:b w:val="0"/>
-          <w:i w:val="0"/>
-          <w:sz w:val="24"/>
-        </w:rPr>
-        <w:t>6.7.2  仪器与设备使用同一套编号体系，并登记在同一设备台账中。仪器条目登记编号、名称、型号、出厂编号、所在部门、安装地点、大类代号、状态和启用日期。仪器条目不按本规程填写管理类别和系统影响性评估编号。仪器所在部门可以另维护仪器清单，清单中的编号与设备台账一致。</w:t>
-      </w:r>
-    </w:p>
-    <w:p>
-      <w:pPr>
-        <w:spacing w:before="120" w:after="80" w:lineRule="auto" w:line="240"/>
-        <w:ind w:firstLine="0" w:left="0"/>
-        <w:jc w:val="left"/>
-      </w:pPr>
-      <w:r>
-        <w:rPr>
-          <w:rFonts w:ascii="宋体" w:hAnsi="宋体" w:eastAsia="宋体" w:cs="宋体"/>
-          <w:b/>
-          <w:i w:val="0"/>
-          <w:sz w:val="24"/>
-        </w:rPr>
-        <w:t>6.8  编号示例</w:t>
-      </w:r>
-    </w:p>
-    <w:p>
-      <w:pPr>
-        <w:spacing w:before="0" w:after="60" w:lineRule="auto" w:line="240"/>
-        <w:ind w:firstLine="0" w:left="0"/>
-        <w:jc w:val="both"/>
-      </w:pPr>
-      <w:r>
-        <w:rPr>
-          <w:rFonts w:ascii="宋体" w:hAnsi="宋体" w:eastAsia="宋体" w:cs="宋体"/>
-          <w:b w:val="0"/>
-          <w:i w:val="0"/>
-          <w:sz w:val="24"/>
-        </w:rPr>
-        <w:t>6.8.1  下列流水号用于演示编号方法，不代表相应设备必须使用该号码。</w:t>
-      </w:r>
-    </w:p>
-    <w:p>
-      <w:pPr>
-        <w:spacing w:before="0" w:after="60" w:lineRule="auto" w:line="240"/>
-        <w:ind w:firstLine="0" w:left="0"/>
-        <w:jc w:val="both"/>
-      </w:pPr>
-      <w:r>
-        <w:rPr>
-          <w:rFonts w:ascii="宋体" w:hAnsi="宋体" w:eastAsia="宋体" w:cs="宋体"/>
-          <w:b w:val="0"/>
-          <w:i w:val="0"/>
-          <w:sz w:val="24"/>
-        </w:rPr>
-        <w:t>6.8.2  401 车间的一台全自动胶囊填充机，属于口服固体制剂车间生产设备。假设流水号为 009，则一级编号为 S2C009。其中 S2 为口服固体制剂车间生产设备，C 为 401 车间，009 为流水号。</w:t>
-      </w:r>
-    </w:p>
-    <w:p>
-      <w:pPr>
-        <w:spacing w:before="0" w:after="60" w:lineRule="auto" w:line="240"/>
-        <w:ind w:firstLine="0" w:left="0"/>
-        <w:jc w:val="both"/>
-      </w:pPr>
-      <w:r>
-        <w:rPr>
-          <w:rFonts w:ascii="宋体" w:hAnsi="宋体" w:eastAsia="宋体" w:cs="宋体"/>
-          <w:b w:val="0"/>
-          <w:i w:val="0"/>
-          <w:sz w:val="24"/>
-        </w:rPr>
-        <w:t>6.8.3  401 车间的一台压片机，假设一级编号为 S2C080。固定服务于该压片机的第 1 台吸尘器属于附属装置，二级编号为 S2C080-01。该吸尘器不再另编大类 F 的一级编号。</w:t>
-      </w:r>
-    </w:p>
-    <w:p>
-      <w:pPr>
-        <w:spacing w:before="0" w:after="60" w:lineRule="auto" w:line="240"/>
-        <w:ind w:firstLine="0" w:left="0"/>
-        <w:jc w:val="both"/>
-      </w:pPr>
-      <w:r>
-        <w:rPr>
-          <w:rFonts w:ascii="宋体" w:hAnsi="宋体" w:eastAsia="宋体" w:cs="宋体"/>
-          <w:b w:val="0"/>
-          <w:i w:val="0"/>
-          <w:sz w:val="24"/>
-        </w:rPr>
-        <w:t>6.8.4  质量控制部的一台检测仪器，假设流水号为 001。其编号为 JE001。其中 J 为检测仪器，E 为质量控制部，001 为流水号。该仪器只取得编号，不登记 A 类或 B 类。</w:t>
+        <w:t>6.3.9  以 401 车间压片机的辅助设备吸尘器为例。假设压片机编号为 S2C080，该吸尘器是其第 1 台辅助设备并需要编制二级编号，则该吸尘器的编号为 S2C080-01。</w:t>
       </w:r>
     </w:p>
     <w:p>
@@ -4314,7 +3373,7 @@
           <w:i w:val="0"/>
           <w:sz w:val="21"/>
         </w:rPr>
-        <w:t>表5  示例编号的组成</w:t>
+        <w:t>表5  示例编号的读法</w:t>
       </w:r>
     </w:p>
     <w:tbl>
@@ -4339,7 +3398,7 @@
         </w:trPr>
         <w:tc>
           <w:tcPr>
-            <w:tcW w:type="dxa" w:w="2494"/>
+            <w:tcW w:type="dxa" w:w="2608"/>
             <w:tcBorders>
               <w:top w:val="single" w:sz="4" w:space="0" w:color="000000"/>
               <w:left w:val="single" w:sz="4" w:space="0" w:color="000000"/>
@@ -4363,13 +3422,13 @@
                 <w:i w:val="0"/>
                 <w:sz w:val="21"/>
               </w:rPr>
-              <w:t>设备</w:t>
+              <w:t>示例</w:t>
             </w:r>
           </w:p>
         </w:tc>
         <w:tc>
           <w:tcPr>
-            <w:tcW w:type="dxa" w:w="1304"/>
+            <w:tcW w:type="dxa" w:w="1247"/>
             <w:tcBorders>
               <w:top w:val="single" w:sz="4" w:space="0" w:color="000000"/>
               <w:left w:val="single" w:sz="4" w:space="0" w:color="000000"/>
@@ -4399,7 +3458,7 @@
         </w:tc>
         <w:tc>
           <w:tcPr>
-            <w:tcW w:type="dxa" w:w="1417"/>
+            <w:tcW w:type="dxa" w:w="1360"/>
             <w:tcBorders>
               <w:top w:val="single" w:sz="4" w:space="0" w:color="000000"/>
               <w:left w:val="single" w:sz="4" w:space="0" w:color="000000"/>
@@ -4429,7 +3488,7 @@
         </w:tc>
         <w:tc>
           <w:tcPr>
-            <w:tcW w:type="dxa" w:w="1360"/>
+            <w:tcW w:type="dxa" w:w="1247"/>
             <w:tcBorders>
               <w:top w:val="single" w:sz="4" w:space="0" w:color="000000"/>
               <w:left w:val="single" w:sz="4" w:space="0" w:color="000000"/>
@@ -4459,7 +3518,7 @@
         </w:tc>
         <w:tc>
           <w:tcPr>
-            <w:tcW w:type="dxa" w:w="1134"/>
+            <w:tcW w:type="dxa" w:w="1247"/>
             <w:tcBorders>
               <w:top w:val="single" w:sz="4" w:space="0" w:color="000000"/>
               <w:left w:val="single" w:sz="4" w:space="0" w:color="000000"/>
@@ -4483,7 +3542,7 @@
                 <w:i w:val="0"/>
                 <w:sz w:val="21"/>
               </w:rPr>
-              <w:t>附属序号</w:t>
+              <w:t>辅助序号</w:t>
             </w:r>
           </w:p>
         </w:tc>
@@ -4524,7 +3583,7 @@
         </w:trPr>
         <w:tc>
           <w:tcPr>
-            <w:tcW w:type="dxa" w:w="2494"/>
+            <w:tcW w:type="dxa" w:w="2608"/>
             <w:tcBorders>
               <w:top w:val="single" w:sz="4" w:space="0" w:color="000000"/>
               <w:left w:val="single" w:sz="4" w:space="0" w:color="000000"/>
@@ -4554,7 +3613,7 @@
         </w:tc>
         <w:tc>
           <w:tcPr>
-            <w:tcW w:type="dxa" w:w="1304"/>
+            <w:tcW w:type="dxa" w:w="1247"/>
             <w:tcBorders>
               <w:top w:val="single" w:sz="4" w:space="0" w:color="000000"/>
               <w:left w:val="single" w:sz="4" w:space="0" w:color="000000"/>
@@ -4584,7 +3643,7 @@
         </w:tc>
         <w:tc>
           <w:tcPr>
-            <w:tcW w:type="dxa" w:w="1417"/>
+            <w:tcW w:type="dxa" w:w="1360"/>
             <w:tcBorders>
               <w:top w:val="single" w:sz="4" w:space="0" w:color="000000"/>
               <w:left w:val="single" w:sz="4" w:space="0" w:color="000000"/>
@@ -4614,7 +3673,7 @@
         </w:tc>
         <w:tc>
           <w:tcPr>
-            <w:tcW w:type="dxa" w:w="1360"/>
+            <w:tcW w:type="dxa" w:w="1247"/>
             <w:tcBorders>
               <w:top w:val="single" w:sz="4" w:space="0" w:color="000000"/>
               <w:left w:val="single" w:sz="4" w:space="0" w:color="000000"/>
@@ -4644,7 +3703,7 @@
         </w:tc>
         <w:tc>
           <w:tcPr>
-            <w:tcW w:type="dxa" w:w="1134"/>
+            <w:tcW w:type="dxa" w:w="1247"/>
             <w:tcBorders>
               <w:top w:val="single" w:sz="4" w:space="0" w:color="000000"/>
               <w:left w:val="single" w:sz="4" w:space="0" w:color="000000"/>
@@ -4709,7 +3768,7 @@
         </w:trPr>
         <w:tc>
           <w:tcPr>
-            <w:tcW w:type="dxa" w:w="2494"/>
+            <w:tcW w:type="dxa" w:w="2608"/>
             <w:tcBorders>
               <w:top w:val="single" w:sz="4" w:space="0" w:color="000000"/>
               <w:left w:val="single" w:sz="4" w:space="0" w:color="000000"/>
@@ -4733,13 +3792,13 @@
                 <w:i w:val="0"/>
                 <w:sz w:val="21"/>
               </w:rPr>
-              <w:t>上述压片机</w:t>
+              <w:t>401车间压片机（假设）</w:t>
             </w:r>
           </w:p>
         </w:tc>
         <w:tc>
           <w:tcPr>
-            <w:tcW w:type="dxa" w:w="1304"/>
+            <w:tcW w:type="dxa" w:w="1247"/>
             <w:tcBorders>
               <w:top w:val="single" w:sz="4" w:space="0" w:color="000000"/>
               <w:left w:val="single" w:sz="4" w:space="0" w:color="000000"/>
@@ -4769,7 +3828,7 @@
         </w:tc>
         <w:tc>
           <w:tcPr>
-            <w:tcW w:type="dxa" w:w="1417"/>
+            <w:tcW w:type="dxa" w:w="1360"/>
             <w:tcBorders>
               <w:top w:val="single" w:sz="4" w:space="0" w:color="000000"/>
               <w:left w:val="single" w:sz="4" w:space="0" w:color="000000"/>
@@ -4799,7 +3858,7 @@
         </w:tc>
         <w:tc>
           <w:tcPr>
-            <w:tcW w:type="dxa" w:w="1360"/>
+            <w:tcW w:type="dxa" w:w="1247"/>
             <w:tcBorders>
               <w:top w:val="single" w:sz="4" w:space="0" w:color="000000"/>
               <w:left w:val="single" w:sz="4" w:space="0" w:color="000000"/>
@@ -4829,7 +3888,7 @@
         </w:tc>
         <w:tc>
           <w:tcPr>
-            <w:tcW w:type="dxa" w:w="1134"/>
+            <w:tcW w:type="dxa" w:w="1247"/>
             <w:tcBorders>
               <w:top w:val="single" w:sz="4" w:space="0" w:color="000000"/>
               <w:left w:val="single" w:sz="4" w:space="0" w:color="000000"/>
@@ -4894,7 +3953,7 @@
         </w:trPr>
         <w:tc>
           <w:tcPr>
-            <w:tcW w:type="dxa" w:w="2494"/>
+            <w:tcW w:type="dxa" w:w="2608"/>
             <w:tcBorders>
               <w:top w:val="single" w:sz="4" w:space="0" w:color="000000"/>
               <w:left w:val="single" w:sz="4" w:space="0" w:color="000000"/>
@@ -4918,13 +3977,13 @@
                 <w:i w:val="0"/>
                 <w:sz w:val="21"/>
               </w:rPr>
-              <w:t>该压片机第1台专用吸尘器</w:t>
+              <w:t>该压片机的第1台吸尘器</w:t>
             </w:r>
           </w:p>
         </w:tc>
         <w:tc>
           <w:tcPr>
-            <w:tcW w:type="dxa" w:w="1304"/>
+            <w:tcW w:type="dxa" w:w="1247"/>
             <w:tcBorders>
               <w:top w:val="single" w:sz="4" w:space="0" w:color="000000"/>
               <w:left w:val="single" w:sz="4" w:space="0" w:color="000000"/>
@@ -4948,37 +4007,7 @@
                 <w:i w:val="0"/>
                 <w:sz w:val="21"/>
               </w:rPr>
-              <w:t>同主设备</w:t>
-            </w:r>
-          </w:p>
-        </w:tc>
-        <w:tc>
-          <w:tcPr>
-            <w:tcW w:type="dxa" w:w="1417"/>
-            <w:tcBorders>
-              <w:top w:val="single" w:sz="4" w:space="0" w:color="000000"/>
-              <w:left w:val="single" w:sz="4" w:space="0" w:color="000000"/>
-              <w:bottom w:val="single" w:sz="4" w:space="0" w:color="000000"/>
-              <w:right w:val="single" w:sz="4" w:space="0" w:color="000000"/>
-            </w:tcBorders>
-            <w:shd w:val="clear" w:color="auto" w:fill="FFFFFF"/>
-            <w:vAlign w:val="center"/>
-          </w:tcPr>
-          <w:p>
-            <w:pPr>
-              <w:spacing w:before="20" w:after="20" w:lineRule="auto" w:line="216"/>
-              <w:ind w:firstLine="0" w:left="0"/>
-              <w:jc w:val="left"/>
-            </w:pPr>
-            <w:r/>
-            <w:r>
-              <w:rPr>
-                <w:rFonts w:ascii="宋体" w:hAnsi="宋体" w:eastAsia="宋体" w:cs="宋体"/>
-                <w:b w:val="0"/>
-                <w:i w:val="0"/>
-                <w:sz w:val="21"/>
-              </w:rPr>
-              <w:t>同主设备</w:t>
+              <w:t>沿用压片机</w:t>
             </w:r>
           </w:p>
         </w:tc>
@@ -5008,13 +4037,43 @@
                 <w:i w:val="0"/>
                 <w:sz w:val="21"/>
               </w:rPr>
-              <w:t>同主设备</w:t>
+              <w:t>沿用压片机</w:t>
             </w:r>
           </w:p>
         </w:tc>
         <w:tc>
           <w:tcPr>
-            <w:tcW w:type="dxa" w:w="1134"/>
+            <w:tcW w:type="dxa" w:w="1247"/>
+            <w:tcBorders>
+              <w:top w:val="single" w:sz="4" w:space="0" w:color="000000"/>
+              <w:left w:val="single" w:sz="4" w:space="0" w:color="000000"/>
+              <w:bottom w:val="single" w:sz="4" w:space="0" w:color="000000"/>
+              <w:right w:val="single" w:sz="4" w:space="0" w:color="000000"/>
+            </w:tcBorders>
+            <w:shd w:val="clear" w:color="auto" w:fill="FFFFFF"/>
+            <w:vAlign w:val="center"/>
+          </w:tcPr>
+          <w:p>
+            <w:pPr>
+              <w:spacing w:before="20" w:after="20" w:lineRule="auto" w:line="216"/>
+              <w:ind w:firstLine="0" w:left="0"/>
+              <w:jc w:val="left"/>
+            </w:pPr>
+            <w:r/>
+            <w:r>
+              <w:rPr>
+                <w:rFonts w:ascii="宋体" w:hAnsi="宋体" w:eastAsia="宋体" w:cs="宋体"/>
+                <w:b w:val="0"/>
+                <w:i w:val="0"/>
+                <w:sz w:val="21"/>
+              </w:rPr>
+              <w:t>沿用压片机</w:t>
+            </w:r>
+          </w:p>
+        </w:tc>
+        <w:tc>
+          <w:tcPr>
+            <w:tcW w:type="dxa" w:w="1247"/>
             <w:tcBorders>
               <w:top w:val="single" w:sz="4" w:space="0" w:color="000000"/>
               <w:left w:val="single" w:sz="4" w:space="0" w:color="000000"/>
@@ -5103,71 +4162,7 @@
           <w:i w:val="0"/>
           <w:sz w:val="24"/>
         </w:rPr>
-        <w:t>7.1  确定设备管理类别时，以该设备的系统影响性评估结论为准，并以表2帮助理解 A 类、B 类所对应的结论。仪器不按表2分类。</w:t>
-      </w:r>
-    </w:p>
-    <w:p>
-      <w:pPr>
-        <w:spacing w:before="0" w:after="60" w:lineRule="auto" w:line="240"/>
-        <w:ind w:firstLine="0" w:left="0"/>
-        <w:jc w:val="both"/>
-      </w:pPr>
-      <w:r>
-        <w:rPr>
-          <w:rFonts w:ascii="宋体" w:hAnsi="宋体" w:eastAsia="宋体" w:cs="宋体"/>
-          <w:b w:val="0"/>
-          <w:i w:val="0"/>
-          <w:sz w:val="24"/>
-        </w:rPr>
-        <w:t>7.2  配号时按大类代号、部门代号、流水号的顺序连接。301 车间和 302 车间在同一大类下继续使用该序列尚未占用的下一流水号。</w:t>
-      </w:r>
-    </w:p>
-    <w:p>
-      <w:pPr>
-        <w:spacing w:before="0" w:after="60" w:lineRule="auto" w:line="240"/>
-        <w:ind w:firstLine="0" w:left="0"/>
-        <w:jc w:val="both"/>
-      </w:pPr>
-      <w:r>
-        <w:rPr>
-          <w:rFonts w:ascii="宋体" w:hAnsi="宋体" w:eastAsia="宋体" w:cs="宋体"/>
-          <w:b w:val="0"/>
-          <w:i w:val="0"/>
-          <w:sz w:val="24"/>
-        </w:rPr>
-        <w:t>7.3  附属装置的现场标识、使用日志和维修记录使用完整二级编号。该装置改为独立辅助设备时，按第6.6.4款配发新的一级编号，并冻结原二级编号。</w:t>
-      </w:r>
-    </w:p>
-    <w:p>
-      <w:pPr>
-        <w:spacing w:before="0" w:after="60" w:lineRule="auto" w:line="240"/>
-        <w:ind w:firstLine="0" w:left="0"/>
-        <w:jc w:val="both"/>
-      </w:pPr>
-      <w:r>
-        <w:rPr>
-          <w:rFonts w:ascii="宋体" w:hAnsi="宋体" w:eastAsia="宋体" w:cs="宋体"/>
-          <w:b w:val="0"/>
-          <w:i w:val="0"/>
-          <w:sz w:val="24"/>
-        </w:rPr>
-        <w:t>7.4  发现现场编号与设备台账不一致时，使用部门通知设备工程部。核对完成前，不把该不一致编号上的使用记录、维修记录或确认状态转移到另一台设备。设备工程部核对后更正现场标识或台账。已经形成的历史记录保持原样，并在台账中说明差异。</w:t>
-      </w:r>
-    </w:p>
-    <w:p>
-      <w:pPr>
-        <w:spacing w:before="0" w:after="60" w:lineRule="auto" w:line="240"/>
-        <w:ind w:firstLine="0" w:left="0"/>
-        <w:jc w:val="both"/>
-      </w:pPr>
-      <w:r>
-        <w:rPr>
-          <w:rFonts w:ascii="宋体" w:hAnsi="宋体" w:eastAsia="宋体" w:cs="宋体"/>
-          <w:b w:val="0"/>
-          <w:i w:val="0"/>
-          <w:sz w:val="24"/>
-        </w:rPr>
-        <w:t>7.5  仪器只执行本规程的编号。质量控制部仪器的分类、校准和检验使用管理执行 SMP-QC-000-021。其他仪器的分类、校准、使用和维护执行其适用规程。</w:t>
+        <w:t>无</w:t>
       </w:r>
     </w:p>
     <w:p>
@@ -5199,23 +4194,7 @@
           <w:i w:val="0"/>
           <w:sz w:val="24"/>
         </w:rPr>
-        <w:t>8.1  设备分类和编号活动不另行设置环境、职业健康或安全限度。</w:t>
-      </w:r>
-    </w:p>
-    <w:p>
-      <w:pPr>
-        <w:spacing w:before="0" w:after="60" w:lineRule="auto" w:line="240"/>
-        <w:ind w:firstLine="0" w:left="0"/>
-        <w:jc w:val="both"/>
-      </w:pPr>
-      <w:r>
-        <w:rPr>
-          <w:rFonts w:ascii="宋体" w:hAnsi="宋体" w:eastAsia="宋体" w:cs="宋体"/>
-          <w:b w:val="0"/>
-          <w:i w:val="0"/>
-          <w:sz w:val="24"/>
-        </w:rPr>
-        <w:t>8.2  设备安装、清洁、维修和公用系统操作中的职业安全与能源隔离，执行相应安全操作规程，以及 SMP-EQ-100-003、SMP-EQ-100-004。</w:t>
+        <w:t>无</w:t>
       </w:r>
     </w:p>
     <w:p>
@@ -5236,14 +4215,14 @@
     </w:p>
     <w:p>
       <w:pPr>
-        <w:spacing w:before="120" w:after="80" w:lineRule="auto" w:line="240"/>
+        <w:spacing w:before="0" w:after="60" w:lineRule="auto" w:line="240"/>
         <w:ind w:firstLine="0" w:left="0"/>
-        <w:jc w:val="left"/>
+        <w:jc w:val="both"/>
       </w:pPr>
       <w:r>
         <w:rPr>
           <w:rFonts w:ascii="宋体" w:hAnsi="宋体" w:eastAsia="宋体" w:cs="宋体"/>
-          <w:b/>
+          <w:b w:val="0"/>
           <w:i w:val="0"/>
           <w:sz w:val="24"/>
         </w:rPr>
@@ -5263,12 +4242,12 @@
           <w:i w:val="0"/>
           <w:sz w:val="24"/>
         </w:rPr>
-        <w:t>9.1.1  本规程使用公司现有设备台账，不另建台账表单。台账信息满足第6.7.1款。</w:t>
+        <w:t>无</w:t>
       </w:r>
     </w:p>
     <w:p>
       <w:pPr>
-        <w:spacing w:before="0" w:after="60" w:lineRule="auto" w:line="240"/>
+        <w:spacing w:before="80" w:after="60" w:lineRule="auto" w:line="240"/>
         <w:ind w:firstLine="0" w:left="0"/>
         <w:jc w:val="both"/>
       </w:pPr>
@@ -5276,22 +4255,6 @@
         <w:rPr>
           <w:rFonts w:ascii="宋体" w:hAnsi="宋体" w:eastAsia="宋体" w:cs="宋体"/>
           <w:b w:val="0"/>
-          <w:i w:val="0"/>
-          <w:sz w:val="24"/>
-        </w:rPr>
-        <w:t>9.1.2  A 类设备负责人交接记录纳入设备档案。公司已有交接单的，使用该交接单。尚未指定表单的，由文件管理部门指定记录表后实施第6.3.7款的交接记录。</w:t>
-      </w:r>
-    </w:p>
-    <w:p>
-      <w:pPr>
-        <w:spacing w:before="120" w:after="80" w:lineRule="auto" w:line="240"/>
-        <w:ind w:firstLine="0" w:left="0"/>
-        <w:jc w:val="left"/>
-      </w:pPr>
-      <w:r>
-        <w:rPr>
-          <w:rFonts w:ascii="宋体" w:hAnsi="宋体" w:eastAsia="宋体" w:cs="宋体"/>
-          <w:b/>
           <w:i w:val="0"/>
           <w:sz w:val="24"/>
         </w:rPr>
@@ -5311,23 +4274,7 @@
           <w:i w:val="0"/>
           <w:sz w:val="24"/>
         </w:rPr>
-        <w:t>9.2.1  设备台账采用电子系统时，该系统即本规程的设备台账。系统保证现行编号唯一，并保留管理类别变更、重新编号和注销的痕迹。本规程不另建电子记录模板。</w:t>
-      </w:r>
-    </w:p>
-    <w:p>
-      <w:pPr>
-        <w:spacing w:before="0" w:after="60" w:lineRule="auto" w:line="240"/>
-        <w:ind w:firstLine="0" w:left="0"/>
-        <w:jc w:val="both"/>
-      </w:pPr>
-      <w:r>
-        <w:rPr>
-          <w:rFonts w:ascii="宋体" w:hAnsi="宋体" w:eastAsia="宋体" w:cs="宋体"/>
-          <w:b w:val="0"/>
-          <w:i w:val="0"/>
-          <w:sz w:val="24"/>
-        </w:rPr>
-        <w:t>9.2.2  设备的使用日志、维护维修记录、确认记录、培训记录和变更记录，分别按各自的受控规程保存，其中的设备编号与设备台账的现行编号一致。仪器的使用、校准和维护记录按其适用规程保存，并引用本规程配发的编号。变更前的记录保留当时的编号。</w:t>
+        <w:t>无</w:t>
       </w:r>
     </w:p>
     <w:sectPr>

</xml_diff>

<commit_message>
Align the equipment procedure with China GMP wording and structure.
Keep the existing classification, codes, and examples, and state training, records, use logs, status identification, qualification, and maintenance in the terms required by the 2010 GMP.

Co-authored-by: lyan29832 <lyan29832@gmail.com>
</commit_message>
<xml_diff>
--- a/生产设备与仪器分类、编号管理规程.docx
+++ b/生产设备与仪器分类、编号管理规程.docx
@@ -547,7 +547,7 @@
           <w:i w:val="0"/>
           <w:sz w:val="24"/>
         </w:rPr>
-        <w:t>1.1  本规程规定生产设备的分类原则和程序，以及设备、仪器的编号原则和程序，使公司设备、仪器具有统一、唯一的编号，便于识别、使用、维护和管理。</w:t>
+        <w:t>1.1  本规程规定生产设备的分类及分类后的管理要求，以及设备、仪器的唯一编号规则，使设备、仪器能够识别和追溯，并使其使用、清洁、维护、维修和确认处于受控状态。</w:t>
       </w:r>
     </w:p>
     <w:p>
@@ -579,7 +579,7 @@
           <w:i w:val="0"/>
           <w:sz w:val="24"/>
         </w:rPr>
-        <w:t>2.1  本规程适用于生产设备的分类，以及设备、仪器的编号。</w:t>
+        <w:t>2.1  本规程适用于生产设备的分类、分类后的管理和编号，以及仪器的编号。</w:t>
       </w:r>
     </w:p>
     <w:p>
@@ -595,7 +595,23 @@
           <w:i w:val="0"/>
           <w:sz w:val="24"/>
         </w:rPr>
-        <w:t>2.2  本规程对质量控制部只适用于仪器编号。质量控制部仪器的分类执行 SMP-QC-000-021《检验仪器管理规程》。</w:t>
+        <w:t>2.2  本规程对质量控制部只适用于仪器编号。质量控制部仪器的分类、校准和检验使用管理执行 SMP-QC-000-021《检验仪器管理规程》。</w:t>
+      </w:r>
+    </w:p>
+    <w:p>
+      <w:pPr>
+        <w:spacing w:before="0" w:after="60" w:lineRule="auto" w:line="240"/>
+        <w:ind w:firstLine="0" w:left="0"/>
+        <w:jc w:val="both"/>
+      </w:pPr>
+      <w:r>
+        <w:rPr>
+          <w:rFonts w:ascii="宋体" w:hAnsi="宋体" w:eastAsia="宋体" w:cs="宋体"/>
+          <w:b w:val="0"/>
+          <w:i w:val="0"/>
+          <w:sz w:val="24"/>
+        </w:rPr>
+        <w:t>2.3  生产设备的系统影响性评估和组件关键性评估执行 SMP-QA-000-037《系统影响性评估及组件关键性评估管理规程》。本规程只将系统影响性评估结论对应为 A 类或 B 类，不另设组件分级。</w:t>
       </w:r>
     </w:p>
     <w:p>
@@ -627,7 +643,7 @@
           <w:i w:val="0"/>
           <w:sz w:val="24"/>
         </w:rPr>
-        <w:t>3.1  设备工程部负责人和 QA 负责监督本规程的实施。</w:t>
+        <w:t>3.1  设备工程部负责人和 QA 负责监督本规程的实施。发现设备类别与评估结论不一致、编号重复，或现场标识与设备台账不一致时，应当督促责任部门纠正。</w:t>
       </w:r>
     </w:p>
     <w:p>
@@ -643,7 +659,39 @@
           <w:i w:val="0"/>
           <w:sz w:val="24"/>
         </w:rPr>
-        <w:t>3.2  设备工程部及相关人员负责执行本规程。设备归属部门按第6.2款组织本部门设备规程的起草、修订、审核和培训，并指定 A 类设备负责人、完成交接。</w:t>
+        <w:t>3.2  设备工程部及相关人员负责执行本规程，维护设备台账，并保证纳入台账的设备、仪器编号唯一。</w:t>
+      </w:r>
+    </w:p>
+    <w:p>
+      <w:pPr>
+        <w:spacing w:before="0" w:after="60" w:lineRule="auto" w:line="240"/>
+        <w:ind w:firstLine="0" w:left="0"/>
+        <w:jc w:val="both"/>
+      </w:pPr>
+      <w:r>
+        <w:rPr>
+          <w:rFonts w:ascii="宋体" w:hAnsi="宋体" w:eastAsia="宋体" w:cs="宋体"/>
+          <w:b w:val="0"/>
+          <w:i w:val="0"/>
+          <w:sz w:val="24"/>
+        </w:rPr>
+        <w:t>3.3  设备归属部门负责组织本部门设备操作规程、清洁规程和维护规程的起草、修订、审核和培训，指定 A 类设备负责人，并完成交接。</w:t>
+      </w:r>
+    </w:p>
+    <w:p>
+      <w:pPr>
+        <w:spacing w:before="0" w:after="60" w:lineRule="auto" w:line="240"/>
+        <w:ind w:firstLine="0" w:left="0"/>
+        <w:jc w:val="both"/>
+      </w:pPr>
+      <w:r>
+        <w:rPr>
+          <w:rFonts w:ascii="宋体" w:hAnsi="宋体" w:eastAsia="宋体" w:cs="宋体"/>
+          <w:b w:val="0"/>
+          <w:i w:val="0"/>
+          <w:sz w:val="24"/>
+        </w:rPr>
+        <w:t>3.4  仪器所在部门负责使仪器的现场编号与设备台账一致。质量控制部仪器的分类、校准和检验使用管理由 SMP-QC-000-021 规定。</w:t>
       </w:r>
     </w:p>
     <w:p>
@@ -675,7 +723,7 @@
           <w:i w:val="0"/>
           <w:sz w:val="24"/>
         </w:rPr>
-        <w:t>4.1  《药品生产质量管理规范（2010年修订）》（卫生部令第79号）。</w:t>
+        <w:t>4.1  《药品生产质量管理规范（2010年修订）》（卫生部令第79号）第二十六条、第二十七条、第七十二条、第七十九条、第八十条、第八十一条、第八十二条、第八十三条、第八十六条、第八十七条和第八十八条。</w:t>
       </w:r>
     </w:p>
     <w:p>
@@ -691,7 +739,7 @@
           <w:i w:val="0"/>
           <w:sz w:val="24"/>
         </w:rPr>
-        <w:t>4.2  本规程引用下列已有公司文件。文件修订后，按修订后的受控文本执行。</w:t>
+        <w:t>4.2  本规程引用下列公司文件。文件修订后，按修订后的受控文本执行。</w:t>
       </w:r>
     </w:p>
     <w:p>
@@ -729,7 +777,7 @@
         </w:trPr>
         <w:tc>
           <w:tcPr>
-            <w:tcW w:type="dxa" w:w="2154"/>
+            <w:tcW w:type="dxa" w:w="2041"/>
             <w:tcBorders>
               <w:top w:val="single" w:sz="4" w:space="0" w:color="000000"/>
               <w:left w:val="single" w:sz="4" w:space="0" w:color="000000"/>
@@ -759,7 +807,7 @@
         </w:tc>
         <w:tc>
           <w:tcPr>
-            <w:tcW w:type="dxa" w:w="4082"/>
+            <w:tcW w:type="dxa" w:w="3742"/>
             <w:tcBorders>
               <w:top w:val="single" w:sz="4" w:space="0" w:color="000000"/>
               <w:left w:val="single" w:sz="4" w:space="0" w:color="000000"/>
@@ -789,7 +837,7 @@
         </w:tc>
         <w:tc>
           <w:tcPr>
-            <w:tcW w:type="dxa" w:w="2778"/>
+            <w:tcW w:type="dxa" w:w="3231"/>
             <w:tcBorders>
               <w:top w:val="single" w:sz="4" w:space="0" w:color="000000"/>
               <w:left w:val="single" w:sz="4" w:space="0" w:color="000000"/>
@@ -813,7 +861,7 @@
                 <w:i w:val="0"/>
                 <w:sz w:val="21"/>
               </w:rPr>
-              <w:t>用途</w:t>
+              <w:t>在本规程中的用途</w:t>
             </w:r>
           </w:p>
         </w:tc>
@@ -824,7 +872,7 @@
         </w:trPr>
         <w:tc>
           <w:tcPr>
-            <w:tcW w:type="dxa" w:w="2154"/>
+            <w:tcW w:type="dxa" w:w="2041"/>
             <w:tcBorders>
               <w:top w:val="single" w:sz="4" w:space="0" w:color="000000"/>
               <w:left w:val="single" w:sz="4" w:space="0" w:color="000000"/>
@@ -854,7 +902,7 @@
         </w:tc>
         <w:tc>
           <w:tcPr>
-            <w:tcW w:type="dxa" w:w="4082"/>
+            <w:tcW w:type="dxa" w:w="3742"/>
             <w:tcBorders>
               <w:top w:val="single" w:sz="4" w:space="0" w:color="000000"/>
               <w:left w:val="single" w:sz="4" w:space="0" w:color="000000"/>
@@ -884,7 +932,7 @@
         </w:tc>
         <w:tc>
           <w:tcPr>
-            <w:tcW w:type="dxa" w:w="2778"/>
+            <w:tcW w:type="dxa" w:w="3231"/>
             <w:tcBorders>
               <w:top w:val="single" w:sz="4" w:space="0" w:color="000000"/>
               <w:left w:val="single" w:sz="4" w:space="0" w:color="000000"/>
@@ -908,7 +956,7 @@
                 <w:i w:val="0"/>
                 <w:sz w:val="21"/>
               </w:rPr>
-              <w:t>确定系统影响性评估结论</w:t>
+              <w:t>系统影响性评估和组件关键性评估</w:t>
             </w:r>
           </w:p>
         </w:tc>
@@ -919,7 +967,7 @@
         </w:trPr>
         <w:tc>
           <w:tcPr>
-            <w:tcW w:type="dxa" w:w="2154"/>
+            <w:tcW w:type="dxa" w:w="2041"/>
             <w:tcBorders>
               <w:top w:val="single" w:sz="4" w:space="0" w:color="000000"/>
               <w:left w:val="single" w:sz="4" w:space="0" w:color="000000"/>
@@ -949,7 +997,7 @@
         </w:tc>
         <w:tc>
           <w:tcPr>
-            <w:tcW w:type="dxa" w:w="4082"/>
+            <w:tcW w:type="dxa" w:w="3742"/>
             <w:tcBorders>
               <w:top w:val="single" w:sz="4" w:space="0" w:color="000000"/>
               <w:left w:val="single" w:sz="4" w:space="0" w:color="000000"/>
@@ -979,7 +1027,7 @@
         </w:tc>
         <w:tc>
           <w:tcPr>
-            <w:tcW w:type="dxa" w:w="2778"/>
+            <w:tcW w:type="dxa" w:w="3231"/>
             <w:tcBorders>
               <w:top w:val="single" w:sz="4" w:space="0" w:color="000000"/>
               <w:left w:val="single" w:sz="4" w:space="0" w:color="000000"/>
@@ -1014,7 +1062,7 @@
         </w:trPr>
         <w:tc>
           <w:tcPr>
-            <w:tcW w:type="dxa" w:w="2154"/>
+            <w:tcW w:type="dxa" w:w="2041"/>
             <w:tcBorders>
               <w:top w:val="single" w:sz="4" w:space="0" w:color="000000"/>
               <w:left w:val="single" w:sz="4" w:space="0" w:color="000000"/>
@@ -1044,7 +1092,7 @@
         </w:tc>
         <w:tc>
           <w:tcPr>
-            <w:tcW w:type="dxa" w:w="4082"/>
+            <w:tcW w:type="dxa" w:w="3742"/>
             <w:tcBorders>
               <w:top w:val="single" w:sz="4" w:space="0" w:color="000000"/>
               <w:left w:val="single" w:sz="4" w:space="0" w:color="000000"/>
@@ -1074,7 +1122,7 @@
         </w:tc>
         <w:tc>
           <w:tcPr>
-            <w:tcW w:type="dxa" w:w="2778"/>
+            <w:tcW w:type="dxa" w:w="3231"/>
             <w:tcBorders>
               <w:top w:val="single" w:sz="4" w:space="0" w:color="000000"/>
               <w:left w:val="single" w:sz="4" w:space="0" w:color="000000"/>
@@ -1098,7 +1146,7 @@
                 <w:i w:val="0"/>
                 <w:sz w:val="21"/>
               </w:rPr>
-              <w:t>质量控制部仪器的分类</w:t>
+              <w:t>质量控制部仪器的分类、校准和检验使用管理</w:t>
             </w:r>
           </w:p>
         </w:tc>
@@ -1109,7 +1157,7 @@
         </w:trPr>
         <w:tc>
           <w:tcPr>
-            <w:tcW w:type="dxa" w:w="2154"/>
+            <w:tcW w:type="dxa" w:w="2041"/>
             <w:tcBorders>
               <w:top w:val="single" w:sz="4" w:space="0" w:color="000000"/>
               <w:left w:val="single" w:sz="4" w:space="0" w:color="000000"/>
@@ -1139,7 +1187,7 @@
         </w:tc>
         <w:tc>
           <w:tcPr>
-            <w:tcW w:type="dxa" w:w="4082"/>
+            <w:tcW w:type="dxa" w:w="3742"/>
             <w:tcBorders>
               <w:top w:val="single" w:sz="4" w:space="0" w:color="000000"/>
               <w:left w:val="single" w:sz="4" w:space="0" w:color="000000"/>
@@ -1169,7 +1217,7 @@
         </w:tc>
         <w:tc>
           <w:tcPr>
-            <w:tcW w:type="dxa" w:w="2778"/>
+            <w:tcW w:type="dxa" w:w="3231"/>
             <w:tcBorders>
               <w:top w:val="single" w:sz="4" w:space="0" w:color="000000"/>
               <w:left w:val="single" w:sz="4" w:space="0" w:color="000000"/>
@@ -1193,7 +1241,7 @@
                 <w:i w:val="0"/>
                 <w:sz w:val="21"/>
               </w:rPr>
-              <w:t>设备确认</w:t>
+              <w:t>设备确认和再确认</w:t>
             </w:r>
           </w:p>
         </w:tc>
@@ -1204,7 +1252,7 @@
         </w:trPr>
         <w:tc>
           <w:tcPr>
-            <w:tcW w:type="dxa" w:w="2154"/>
+            <w:tcW w:type="dxa" w:w="2041"/>
             <w:tcBorders>
               <w:top w:val="single" w:sz="4" w:space="0" w:color="000000"/>
               <w:left w:val="single" w:sz="4" w:space="0" w:color="000000"/>
@@ -1234,7 +1282,7 @@
         </w:tc>
         <w:tc>
           <w:tcPr>
-            <w:tcW w:type="dxa" w:w="4082"/>
+            <w:tcW w:type="dxa" w:w="3742"/>
             <w:tcBorders>
               <w:top w:val="single" w:sz="4" w:space="0" w:color="000000"/>
               <w:left w:val="single" w:sz="4" w:space="0" w:color="000000"/>
@@ -1264,7 +1312,7 @@
         </w:tc>
         <w:tc>
           <w:tcPr>
-            <w:tcW w:type="dxa" w:w="2778"/>
+            <w:tcW w:type="dxa" w:w="3231"/>
             <w:tcBorders>
               <w:top w:val="single" w:sz="4" w:space="0" w:color="000000"/>
               <w:left w:val="single" w:sz="4" w:space="0" w:color="000000"/>
@@ -1299,7 +1347,7 @@
         </w:trPr>
         <w:tc>
           <w:tcPr>
-            <w:tcW w:type="dxa" w:w="2154"/>
+            <w:tcW w:type="dxa" w:w="2041"/>
             <w:tcBorders>
               <w:top w:val="single" w:sz="4" w:space="0" w:color="000000"/>
               <w:left w:val="single" w:sz="4" w:space="0" w:color="000000"/>
@@ -1329,7 +1377,7 @@
         </w:tc>
         <w:tc>
           <w:tcPr>
-            <w:tcW w:type="dxa" w:w="4082"/>
+            <w:tcW w:type="dxa" w:w="3742"/>
             <w:tcBorders>
               <w:top w:val="single" w:sz="4" w:space="0" w:color="000000"/>
               <w:left w:val="single" w:sz="4" w:space="0" w:color="000000"/>
@@ -1359,7 +1407,7 @@
         </w:tc>
         <w:tc>
           <w:tcPr>
-            <w:tcW w:type="dxa" w:w="2778"/>
+            <w:tcW w:type="dxa" w:w="3231"/>
             <w:tcBorders>
               <w:top w:val="single" w:sz="4" w:space="0" w:color="000000"/>
               <w:left w:val="single" w:sz="4" w:space="0" w:color="000000"/>
@@ -1402,7 +1450,7 @@
           <w:i w:val="0"/>
           <w:sz w:val="24"/>
         </w:rPr>
-        <w:t>4.3  本规程中的“确认”对应 qualification，“预防性维护”对应 preventive maintenance。设备、仪器编号用于唯一识别，对应 unique identification。</w:t>
+        <w:t>4.3  本规程中的“确认”对应 qualification，“预防性维护”对应 preventive maintenance，设备、仪器编号用于唯一识别，对应 unique identification。中国生产现场的执行依据为第4.1款和表1。</w:t>
       </w:r>
     </w:p>
     <w:p>
@@ -1434,7 +1482,7 @@
           <w:i w:val="0"/>
           <w:sz w:val="24"/>
         </w:rPr>
-        <w:t>5.1  直接影响系统、非直接影响系统：按 SMP-QA-000-037 得出的系统影响性评估结论。</w:t>
+        <w:t>5.1  直接影响系统、非直接影响系统：按 SMP-QA-000-037 得出的系统影响性评估结论。该规程对上述术语另有定义时，以该规程为准。</w:t>
       </w:r>
     </w:p>
     <w:p>
@@ -1530,7 +1578,23 @@
           <w:i w:val="0"/>
           <w:sz w:val="24"/>
         </w:rPr>
-        <w:t>5.7  辅助设备：有两种用法，含义不同。作为设备大类时，代号为 F，按一级编号编制。作为某台已编号设备的辅助设备或附属装置且需要二级编号时，序号附在该设备编号之后。</w:t>
+        <w:t>5.7  辅助设备：作为设备大类时，代号为 F，按一级编号编制。作为某台已编号设备的辅助设备或附属装置且需要二级编号时，序号附在该设备编号之后。</w:t>
+      </w:r>
+    </w:p>
+    <w:p>
+      <w:pPr>
+        <w:spacing w:before="0" w:after="60" w:lineRule="auto" w:line="240"/>
+        <w:ind w:firstLine="0" w:left="0"/>
+        <w:jc w:val="both"/>
+      </w:pPr>
+      <w:r>
+        <w:rPr>
+          <w:rFonts w:ascii="宋体" w:hAnsi="宋体" w:eastAsia="宋体" w:cs="宋体"/>
+          <w:b w:val="0"/>
+          <w:i w:val="0"/>
+          <w:sz w:val="24"/>
+        </w:rPr>
+        <w:t>5.8  使用日志：用于药品生产或检验的设备和仪器的记录，内容包括使用、清洁、维护和维修情况以及日期、时间、所生产及检验的药品名称、规格和批号等。本规程中 A 类设备的使用记录属于使用日志。</w:t>
       </w:r>
     </w:p>
     <w:p>
@@ -1578,7 +1642,7 @@
           <w:i w:val="0"/>
           <w:sz w:val="24"/>
         </w:rPr>
-        <w:t>6.1.1  生产设备按 SMP-QA-000-037 进行系统影响性评估。评估结论为直接影响系统的，按 A 类管理；评估结论为非直接影响系统的，按 B 类管理。</w:t>
+        <w:t>6.1.1  生产设备投入使用前，归属部门按 SMP-QA-000-037 完成系统影响性评估。评估结论为直接影响系统的，按 A 类管理；评估结论为非直接影响系统的，按 B 类管理。组件关键性评估按 SMP-QA-000-037 执行，不在本规程中另行分级。</w:t>
       </w:r>
     </w:p>
     <w:p>
@@ -1594,7 +1658,7 @@
           <w:i w:val="0"/>
           <w:sz w:val="24"/>
         </w:rPr>
-        <w:t>6.1.2  两类设备见下表。表中“如”后为示例。</w:t>
+        <w:t>6.1.2  管理类别见下表。表中“如”后的设备为示例，具体设备的类别以其系统影响性评估结论为准。</w:t>
       </w:r>
     </w:p>
     <w:p>
@@ -1834,7 +1898,7 @@
           <w:i w:val="0"/>
           <w:sz w:val="24"/>
         </w:rPr>
-        <w:t>6.1.3  设备类别记入设备台账。类别确定后不得改变。确需改变设备类别时，按 SMP-QA-000-030《变更控制管理制度》执行。</w:t>
+        <w:t>6.1.3  设备类别记入设备台账。类别确定后不得改变。确需改变时，应当重新评估，并按 SMP-QA-000-030《变更控制管理制度》批准。变更批准前，设备继续按原类别管理。</w:t>
       </w:r>
     </w:p>
     <w:p>
@@ -1850,7 +1914,7 @@
           <w:i w:val="0"/>
           <w:sz w:val="24"/>
         </w:rPr>
-        <w:t>6.1.4  本规程不对质量控制部的仪器进行分类。质量控制部仪器的分类由 SMP-QC-000-021 另行管理。质量控制部仪器的编号按第6.3款执行。</w:t>
+        <w:t>6.1.4  本规程不对质量控制部的仪器进行分类。质量控制部仪器的分类由 SMP-QC-000-021 管理。该类仪器的编号按第6.3款执行。</w:t>
       </w:r>
     </w:p>
     <w:p>
@@ -1871,7 +1935,7 @@
     </w:p>
     <w:p>
       <w:pPr>
-        <w:spacing w:before="40" w:after="60" w:lineRule="auto" w:line="240"/>
+        <w:spacing w:before="0" w:after="60" w:lineRule="auto" w:line="240"/>
         <w:ind w:firstLine="0" w:left="0"/>
         <w:jc w:val="both"/>
       </w:pPr>
@@ -1882,7 +1946,7 @@
           <w:i w:val="0"/>
           <w:sz w:val="24"/>
         </w:rPr>
-        <w:t>6.2.1  A 类设备</w:t>
+        <w:t>6.2.1  从事设备操作和维护的人员应当经过与岗位要求相适应的培训，培训记录予以保存。培训合格后方可上岗。</w:t>
       </w:r>
     </w:p>
     <w:p>
@@ -1898,7 +1962,23 @@
           <w:i w:val="0"/>
           <w:sz w:val="24"/>
         </w:rPr>
-        <w:t>6.2.1.1  A 类设备由归属部门负责组织操作规程、清洁规程和维护规程的起草、修订和审核，并对相关人员进行培训。</w:t>
+        <w:t>6.2.2  设备应当建立使用、清洁、维护和维修的操作规程，并保存相应记录。A 类设备的规程形式执行第6.2.3款，B 类设备的规程形式执行第6.2.4款。</w:t>
+      </w:r>
+    </w:p>
+    <w:p>
+      <w:pPr>
+        <w:spacing w:before="80" w:after="60" w:lineRule="auto" w:line="240"/>
+        <w:ind w:firstLine="0" w:left="0"/>
+        <w:jc w:val="both"/>
+      </w:pPr>
+      <w:r>
+        <w:rPr>
+          <w:rFonts w:ascii="宋体" w:hAnsi="宋体" w:eastAsia="宋体" w:cs="宋体"/>
+          <w:b w:val="0"/>
+          <w:i w:val="0"/>
+          <w:sz w:val="24"/>
+        </w:rPr>
+        <w:t>6.2.3  A 类设备</w:t>
       </w:r>
     </w:p>
     <w:p>
@@ -1914,7 +1994,7 @@
           <w:i w:val="0"/>
           <w:sz w:val="24"/>
         </w:rPr>
-        <w:t>6.2.1.2  A 类设备的归属部门应当指定设备负责人。设备负责人离职或调岗时，应当与继任者完成交接。交接内容至少包括：设备使用记录、维护保养记录、操作规程、维护规程、清洁规程、备品备件、设备运行情况及注意事项。</w:t>
+        <w:t>6.2.3.1  A 类设备由归属部门负责组织操作规程、清洁规程和维护规程分别起草、修订和审核，并对相关人员进行培训。</w:t>
       </w:r>
     </w:p>
     <w:p>
@@ -1930,7 +2010,23 @@
           <w:i w:val="0"/>
           <w:sz w:val="24"/>
         </w:rPr>
-        <w:t>6.2.1.3  A 类设备应当建立相应的使用记录，如实记录设备运行情况。</w:t>
+        <w:t>6.2.3.2  归属部门应当指定 A 类设备负责人。设备负责人离职或调岗时，应当与继任者完成交接。交接内容至少包括：设备使用记录、维护保养记录、操作规程、维护规程、清洁规程、备品备件、设备运行情况及注意事项。交接应当形成记录并纳入设备档案。公司已有交接记录的，使用该记录，本规程不另建表单。</w:t>
+      </w:r>
+    </w:p>
+    <w:p>
+      <w:pPr>
+        <w:spacing w:before="0" w:after="60" w:lineRule="auto" w:line="240"/>
+        <w:ind w:firstLine="0" w:left="0"/>
+        <w:jc w:val="both"/>
+      </w:pPr>
+      <w:r>
+        <w:rPr>
+          <w:rFonts w:ascii="宋体" w:hAnsi="宋体" w:eastAsia="宋体" w:cs="宋体"/>
+          <w:b w:val="0"/>
+          <w:i w:val="0"/>
+          <w:sz w:val="24"/>
+        </w:rPr>
+        <w:t>6.2.3.3  A 类设备应当建立使用记录，如实记录设备运行情况。用于药品生产的设备，使用记录至少包括使用、清洁、维护和维修情况以及日期、时间、所生产药品的名称、规格和批号等。多个批次共用的公用系统，使用记录应当包括运行、清洁、维护、维修以及日期和时间，并使相应批记录能够追溯到该运行记录。</w:t>
       </w:r>
     </w:p>
     <w:p>
@@ -1946,7 +2042,7 @@
           <w:i w:val="0"/>
           <w:sz w:val="24"/>
         </w:rPr>
-        <w:t>6.2.2  B 类设备</w:t>
+        <w:t>6.2.4  B 类设备</w:t>
       </w:r>
     </w:p>
     <w:p>
@@ -1962,7 +2058,7 @@
           <w:i w:val="0"/>
           <w:sz w:val="24"/>
         </w:rPr>
-        <w:t>6.2.2.1  归属部门应当根据 B 类设备的结构复杂程度和设备说明书的要求，组织操作规程、清洁规程和维护规程的起草、修订和审核，并确保相关操作人员、维护人员经培训合格后方可上岗。</w:t>
+        <w:t>6.2.4.1  归属部门应当根据 B 类设备的结构复杂程度和设备说明书的要求，组织操作规程、清洁规程和维护规程的起草、修订和审核。相关操作人员、维护人员应当满足第6.2.1款的培训要求后方可上岗。</w:t>
       </w:r>
     </w:p>
     <w:p>
@@ -1978,7 +2074,23 @@
           <w:i w:val="0"/>
           <w:sz w:val="24"/>
         </w:rPr>
-        <w:t>6.2.2.2  结构简单、操作及维护要求明确的 B 类设备，可以将操作规程、清洁规程和维护规程合并为一份操作维护清洁规程。合并后仍应当确保使用、清洁和维护要求完整、清晰、可执行。</w:t>
+        <w:t>6.2.4.2  结构简单、操作及维护要求明确的 B 类设备，可以将操作规程、清洁规程和维护规程合并为一份操作维护清洁规程。合并后仍应当确保使用、清洁和维护要求完整、清晰、可执行，并保存使用、清洁、维护和维修的相应记录。</w:t>
+      </w:r>
+    </w:p>
+    <w:p>
+      <w:pPr>
+        <w:spacing w:before="0" w:after="60" w:lineRule="auto" w:line="240"/>
+        <w:ind w:firstLine="0" w:left="0"/>
+        <w:jc w:val="both"/>
+      </w:pPr>
+      <w:r>
+        <w:rPr>
+          <w:rFonts w:ascii="宋体" w:hAnsi="宋体" w:eastAsia="宋体" w:cs="宋体"/>
+          <w:b w:val="0"/>
+          <w:i w:val="0"/>
+          <w:sz w:val="24"/>
+        </w:rPr>
+        <w:t>6.2.4.3  不用于药品生产的 B 类设备，应当保存与其实际使用、清洁和维护相适应的记录。用于药品生产的 B 类设备，使用记录的内容执行第6.2.3.3款。</w:t>
       </w:r>
     </w:p>
     <w:p>
@@ -1994,7 +2106,7 @@
           <w:i w:val="0"/>
           <w:sz w:val="24"/>
         </w:rPr>
-        <w:t>6.2.3  设备确认按照 SMP-VP-000-004《设施、设备确认管理规程》执行。</w:t>
+        <w:t>6.2.5  设备确认按照 SMP-VP-000-004《设施、设备确认管理规程》执行。已完成确认的生产设备应当在确认的参数范围内使用。经改造或重大维修的设备，应当按该规程完成再确认，符合要求后方可用于生产。</w:t>
       </w:r>
     </w:p>
     <w:p>
@@ -2010,7 +2122,7 @@
           <w:i w:val="0"/>
           <w:sz w:val="24"/>
         </w:rPr>
-        <w:t>6.2.4  设备维修、预防性维护按照 SMP-EQ-100-004《设备设施故障报告与维修管理规程》和 SMP-EQ-100-003《设备预防性维护、维修管理规程》执行。</w:t>
+        <w:t>6.2.6  设备维修、预防性维护按照 SMP-EQ-100-004《设备设施故障报告与维修管理规程》和 SMP-EQ-100-003《设备预防性维护、维修管理规程》执行。维护和维修不得影响产品质量，并应当有记录。记录使用本规程规定的设备编号。</w:t>
       </w:r>
     </w:p>
     <w:p>
@@ -2042,7 +2154,7 @@
           <w:i w:val="0"/>
           <w:sz w:val="24"/>
         </w:rPr>
-        <w:t>6.3.1  设备、仪器的一级编号由三段依次连接，段间不插入空格或其他符号：设备大类代号、部门代号、三位流水号。</w:t>
+        <w:t>6.3.1  设备、仪器的一级编号由设备大类代号、部门代号和三位流水号依次连接组成，段间不插入空格或其他符号。纳入设备台账的每台设备、仪器只有一个现行编号，完整编号在公司内唯一。已经用于记录的编号不再授予另一台设备或仪器。</w:t>
       </w:r>
     </w:p>
     <w:p>
@@ -2074,7 +2186,7 @@
           <w:i w:val="0"/>
           <w:sz w:val="24"/>
         </w:rPr>
-        <w:t>6.3.3  大类代号 F 表示按一级编号单独编制的辅助设备。附属于某台已编号设备、并按第6.3.2款编制二级编号的辅助设备或附属装置，使用主设备编号加序号，不使用大类代号 F。</w:t>
+        <w:t>6.3.3  大类代号 F 用于按一级编号单独编制的辅助设备。按第6.3.2款编制二级编号的辅助设备或附属装置，使用主设备编号加序号。</w:t>
       </w:r>
     </w:p>
     <w:p>
@@ -2090,7 +2202,7 @@
           <w:i w:val="0"/>
           <w:sz w:val="24"/>
         </w:rPr>
-        <w:t>6.3.4  设备大类代号按表3使用。S1、S2 在编号中按表内写法书写。</w:t>
+        <w:t>6.3.4  设备大类代号按表3使用。编号中的 S1、S2 按表内字母和数字书写。</w:t>
       </w:r>
     </w:p>
     <w:p>
@@ -3325,7 +3437,7 @@
           <w:i w:val="0"/>
           <w:sz w:val="24"/>
         </w:rPr>
-        <w:t>6.3.7  301 车间和 302 车间的部门代号均为 B。同一设备大类下，这两个车间共用一个流水号序列，以保证完整编号唯一。</w:t>
+        <w:t>6.3.7  301 车间和 302 车间的部门代号均为 B。同一设备大类下，这两个车间共用一个流水号序列，以保证编号唯一。</w:t>
       </w:r>
     </w:p>
     <w:p>
@@ -3341,7 +3453,7 @@
           <w:i w:val="0"/>
           <w:sz w:val="24"/>
         </w:rPr>
-        <w:t>6.3.8  以 401 车间全自动胶囊填充机为例。该设备的大类为口服固体制剂车间生产设备，部门为 401 车间。假设流水号为 009，则编号为 S2C009。其中 S2 为设备大类，C 为部门代号，009 为流水号。</w:t>
+        <w:t>6.3.8  以 401 车间全自动胶囊填充机为例。该设备属于口服固体制剂车间生产设备，部门为 401 车间。假设流水号为 009，编号为 S2C009。其中 S2 为设备大类，C 为部门代号，009 为流水号。</w:t>
       </w:r>
     </w:p>
     <w:p>
@@ -3357,7 +3469,7 @@
           <w:i w:val="0"/>
           <w:sz w:val="24"/>
         </w:rPr>
-        <w:t>6.3.9  以 401 车间压片机的辅助设备吸尘器为例。假设压片机编号为 S2C080，该吸尘器是其第 1 台辅助设备并需要编制二级编号，则该吸尘器的编号为 S2C080-01。</w:t>
+        <w:t>6.3.9  以 401 车间压片机的辅助设备吸尘器为例。假设压片机编号为 S2C080，该吸尘器为其第 1 台辅助设备并需要编制二级编号，则编号为 S2C080-01。</w:t>
       </w:r>
     </w:p>
     <w:p>
@@ -4135,6 +4247,38 @@
     </w:tbl>
     <w:p>
       <w:pPr>
+        <w:spacing w:before="120" w:after="60" w:lineRule="auto" w:line="240"/>
+        <w:ind w:firstLine="0" w:left="0"/>
+        <w:jc w:val="both"/>
+      </w:pPr>
+      <w:r>
+        <w:rPr>
+          <w:rFonts w:ascii="宋体" w:hAnsi="宋体" w:eastAsia="宋体" w:cs="宋体"/>
+          <w:b w:val="0"/>
+          <w:i w:val="0"/>
+          <w:sz w:val="24"/>
+        </w:rPr>
+        <w:t>6.3.10  生产设备应当有明显的状态标识，并标明本规程规定的设备编号。有内容物时，应当标明内容物的名称、规格和批号；无内容物时，应当标明清洁状态。不合格的设备在移出生产区或质量控制区之前，应当有醒目的状态标识。</w:t>
+      </w:r>
+    </w:p>
+    <w:p>
+      <w:pPr>
+        <w:spacing w:before="0" w:after="60" w:lineRule="auto" w:line="240"/>
+        <w:ind w:firstLine="0" w:left="0"/>
+        <w:jc w:val="both"/>
+      </w:pPr>
+      <w:r>
+        <w:rPr>
+          <w:rFonts w:ascii="宋体" w:hAnsi="宋体" w:eastAsia="宋体" w:cs="宋体"/>
+          <w:b w:val="0"/>
+          <w:i w:val="0"/>
+          <w:sz w:val="24"/>
+        </w:rPr>
+        <w:t>6.3.11  仪器的现场标识使用本规程配发的编号。仪器的校准状态标识和使用记录执行其适用规程；质量控制部仪器执行 SMP-QC-000-021。</w:t>
+      </w:r>
+    </w:p>
+    <w:p>
+      <w:pPr>
         <w:spacing w:before="200" w:after="80" w:lineRule="auto" w:line="240"/>
         <w:ind w:firstLine="0" w:left="0"/>
         <w:jc w:val="left"/>
@@ -4162,7 +4306,71 @@
           <w:i w:val="0"/>
           <w:sz w:val="24"/>
         </w:rPr>
-        <w:t>无</w:t>
+        <w:t>7.1  设备类别以系统影响性评估结论为准。表2中的示例用于说明类别，不代替该设备的评估结论。</w:t>
+      </w:r>
+    </w:p>
+    <w:p>
+      <w:pPr>
+        <w:spacing w:before="0" w:after="60" w:lineRule="auto" w:line="240"/>
+        <w:ind w:firstLine="0" w:left="0"/>
+        <w:jc w:val="both"/>
+      </w:pPr>
+      <w:r>
+        <w:rPr>
+          <w:rFonts w:ascii="宋体" w:hAnsi="宋体" w:eastAsia="宋体" w:cs="宋体"/>
+          <w:b w:val="0"/>
+          <w:i w:val="0"/>
+          <w:sz w:val="24"/>
+        </w:rPr>
+        <w:t>7.2  大类代号 F 与二级编号是两种编法。需要二级编号的辅助设备或附属装置，编号写在主设备编号之后。</w:t>
+      </w:r>
+    </w:p>
+    <w:p>
+      <w:pPr>
+        <w:spacing w:before="0" w:after="60" w:lineRule="auto" w:line="240"/>
+        <w:ind w:firstLine="0" w:left="0"/>
+        <w:jc w:val="both"/>
+      </w:pPr>
+      <w:r>
+        <w:rPr>
+          <w:rFonts w:ascii="宋体" w:hAnsi="宋体" w:eastAsia="宋体" w:cs="宋体"/>
+          <w:b w:val="0"/>
+          <w:i w:val="0"/>
+          <w:sz w:val="24"/>
+        </w:rPr>
+        <w:t>7.3  301 车间与 302 车间使用同一部门代号 B，同一大类下的流水号连续编制，不各自从 001 起编。</w:t>
+      </w:r>
+    </w:p>
+    <w:p>
+      <w:pPr>
+        <w:spacing w:before="0" w:after="60" w:lineRule="auto" w:line="240"/>
+        <w:ind w:firstLine="0" w:left="0"/>
+        <w:jc w:val="both"/>
+      </w:pPr>
+      <w:r>
+        <w:rPr>
+          <w:rFonts w:ascii="宋体" w:hAnsi="宋体" w:eastAsia="宋体" w:cs="宋体"/>
+          <w:b w:val="0"/>
+          <w:i w:val="0"/>
+          <w:sz w:val="24"/>
+        </w:rPr>
+        <w:t>7.4  质量控制部仪器的分类执行 SMP-QC-000-021，编号的结构和唯一性执行本规程。</w:t>
+      </w:r>
+    </w:p>
+    <w:p>
+      <w:pPr>
+        <w:spacing w:before="0" w:after="60" w:lineRule="auto" w:line="240"/>
+        <w:ind w:firstLine="0" w:left="0"/>
+        <w:jc w:val="both"/>
+      </w:pPr>
+      <w:r>
+        <w:rPr>
+          <w:rFonts w:ascii="宋体" w:hAnsi="宋体" w:eastAsia="宋体" w:cs="宋体"/>
+          <w:b w:val="0"/>
+          <w:i w:val="0"/>
+          <w:sz w:val="24"/>
+        </w:rPr>
+        <w:t>7.5  现场编号与设备台账不一致时，使用部门通知设备工程部核对。核对完成前，不把该编号上的使用、维修或确认记录改记到另一台设备或仪器。历史记录保持原编号。</w:t>
       </w:r>
     </w:p>
     <w:p>
@@ -4194,7 +4402,23 @@
           <w:i w:val="0"/>
           <w:sz w:val="24"/>
         </w:rPr>
-        <w:t>无</w:t>
+        <w:t>8.1  设备分类和编号不另设环境、职业健康或安全限度。</w:t>
+      </w:r>
+    </w:p>
+    <w:p>
+      <w:pPr>
+        <w:spacing w:before="0" w:after="60" w:lineRule="auto" w:line="240"/>
+        <w:ind w:firstLine="0" w:left="0"/>
+        <w:jc w:val="both"/>
+      </w:pPr>
+      <w:r>
+        <w:rPr>
+          <w:rFonts w:ascii="宋体" w:hAnsi="宋体" w:eastAsia="宋体" w:cs="宋体"/>
+          <w:b w:val="0"/>
+          <w:i w:val="0"/>
+          <w:sz w:val="24"/>
+        </w:rPr>
+        <w:t>8.2  设备维修和预防性维护中的安全要求，执行 SMP-EQ-100-003 和 SMP-EQ-100-004。</w:t>
       </w:r>
     </w:p>
     <w:p>
@@ -4242,7 +4466,39 @@
           <w:i w:val="0"/>
           <w:sz w:val="24"/>
         </w:rPr>
-        <w:t>无</w:t>
+        <w:t>9.1.1  设备台账使用公司现有台账，本规程不另建表单。台账应当能够追溯现行编号、名称、部门或部门代号、安装地点和状态。生产设备还应当追溯管理类别。仪器登记编号，不按本规程填写 A 类或 B 类。</w:t>
+      </w:r>
+    </w:p>
+    <w:p>
+      <w:pPr>
+        <w:spacing w:before="0" w:after="60" w:lineRule="auto" w:line="240"/>
+        <w:ind w:firstLine="0" w:left="0"/>
+        <w:jc w:val="both"/>
+      </w:pPr>
+      <w:r>
+        <w:rPr>
+          <w:rFonts w:ascii="宋体" w:hAnsi="宋体" w:eastAsia="宋体" w:cs="宋体"/>
+          <w:b w:val="0"/>
+          <w:i w:val="0"/>
+          <w:sz w:val="24"/>
+        </w:rPr>
+        <w:t>9.1.2  A 类设备使用记录按第6.2.3.3款填写，使用公司现有使用记录，本规程不另建表单。</w:t>
+      </w:r>
+    </w:p>
+    <w:p>
+      <w:pPr>
+        <w:spacing w:before="0" w:after="60" w:lineRule="auto" w:line="240"/>
+        <w:ind w:firstLine="0" w:left="0"/>
+        <w:jc w:val="both"/>
+      </w:pPr>
+      <w:r>
+        <w:rPr>
+          <w:rFonts w:ascii="宋体" w:hAnsi="宋体" w:eastAsia="宋体" w:cs="宋体"/>
+          <w:b w:val="0"/>
+          <w:i w:val="0"/>
+          <w:sz w:val="24"/>
+        </w:rPr>
+        <w:t>9.1.3  A 类设备负责人交接记录按第6.2.3.2款纳入设备档案。</w:t>
       </w:r>
     </w:p>
     <w:p>
@@ -4274,7 +4530,23 @@
           <w:i w:val="0"/>
           <w:sz w:val="24"/>
         </w:rPr>
-        <w:t>无</w:t>
+        <w:t>9.2.1  设备台账为电子系统时，该系统即本规程的设备台账，应当保证现行编号唯一。本规程不另建电子模板。</w:t>
+      </w:r>
+    </w:p>
+    <w:p>
+      <w:pPr>
+        <w:spacing w:before="0" w:after="60" w:lineRule="auto" w:line="240"/>
+        <w:ind w:firstLine="0" w:left="0"/>
+        <w:jc w:val="both"/>
+      </w:pPr>
+      <w:r>
+        <w:rPr>
+          <w:rFonts w:ascii="宋体" w:hAnsi="宋体" w:eastAsia="宋体" w:cs="宋体"/>
+          <w:b w:val="0"/>
+          <w:i w:val="0"/>
+          <w:sz w:val="24"/>
+        </w:rPr>
+        <w:t>9.2.2  确认记录、维护维修记录按所引用的规程保存，并使用本规程规定的编号。变更前已经形成的记录保留当时的编号。</w:t>
       </w:r>
     </w:p>
     <w:sectPr>

</xml_diff>

<commit_message>
Merge the repeated A-class procedure, record, and handover clauses.
Keep procedure control and use records in one requirement, and limit the handover clause to transfer of those records plus spares and current operating precautions.

Co-authored-by: lyan29832 <lyan29832@gmail.com>
</commit_message>
<xml_diff>
--- a/生产设备与仪器分类、编号管理规程.docx
+++ b/生产设备与仪器分类、编号管理规程.docx
@@ -1994,7 +1994,7 @@
           <w:i w:val="0"/>
           <w:sz w:val="24"/>
         </w:rPr>
-        <w:t>6.2.3.1  A 类设备由归属部门负责组织操作规程、清洁规程和维护规程分别起草、修订和审核，并对相关人员进行培训。</w:t>
+        <w:t>6.2.3.1  归属部门应当组织 A 类设备操作规程、清洁规程和维护规程的起草、修订和审核，建立使用记录并如实记录设备运行情况，同时对相关人员进行培训。用于药品生产的设备，使用记录至少包括使用、清洁、维护和维修情况以及日期、时间、所生产药品的名称、规格和批号等。多个批次共用的公用系统，使用记录应当包括运行、清洁、维护、维修以及日期和时间，并使相应批记录能够追溯到该运行记录。</w:t>
       </w:r>
     </w:p>
     <w:p>
@@ -2010,23 +2010,7 @@
           <w:i w:val="0"/>
           <w:sz w:val="24"/>
         </w:rPr>
-        <w:t>6.2.3.2  归属部门应当指定 A 类设备负责人。设备负责人离职或调岗时，应当与继任者完成交接。交接内容至少包括：设备使用记录、维护保养记录、操作规程、维护规程、清洁规程、备品备件、设备运行情况及注意事项。交接应当形成记录并纳入设备档案。公司已有交接记录的，使用该记录，本规程不另建表单。</w:t>
-      </w:r>
-    </w:p>
-    <w:p>
-      <w:pPr>
-        <w:spacing w:before="0" w:after="60" w:lineRule="auto" w:line="240"/>
-        <w:ind w:firstLine="0" w:left="0"/>
-        <w:jc w:val="both"/>
-      </w:pPr>
-      <w:r>
-        <w:rPr>
-          <w:rFonts w:ascii="宋体" w:hAnsi="宋体" w:eastAsia="宋体" w:cs="宋体"/>
-          <w:b w:val="0"/>
-          <w:i w:val="0"/>
-          <w:sz w:val="24"/>
-        </w:rPr>
-        <w:t>6.2.3.3  A 类设备应当建立使用记录，如实记录设备运行情况。用于药品生产的设备，使用记录至少包括使用、清洁、维护和维修情况以及日期、时间、所生产药品的名称、规格和批号等。多个批次共用的公用系统，使用记录应当包括运行、清洁、维护、维修以及日期和时间，并使相应批记录能够追溯到该运行记录。</w:t>
+        <w:t>6.2.3.2  归属部门应当指定设备负责人。设备负责人离职或调岗时，应当与继任者交接第6.2.3.1款形成的规程和使用记录，以及维护保养记录、备品备件、设备当前运行情况和注意事项。交接应当形成记录并纳入设备档案。公司已有交接记录的，使用该记录，本规程不另建表单。</w:t>
       </w:r>
     </w:p>
     <w:p>
@@ -2090,7 +2074,7 @@
           <w:i w:val="0"/>
           <w:sz w:val="24"/>
         </w:rPr>
-        <w:t>6.2.4.3  不用于药品生产的 B 类设备，应当保存与其实际使用、清洁和维护相适应的记录。用于药品生产的 B 类设备，使用记录的内容执行第6.2.3.3款。</w:t>
+        <w:t>6.2.4.3  不用于药品生产的 B 类设备，应当保存与其实际使用、清洁和维护相适应的记录。用于药品生产的 B 类设备，使用记录的内容执行第6.2.3.1款。</w:t>
       </w:r>
     </w:p>
     <w:p>
@@ -4482,7 +4466,7 @@
           <w:i w:val="0"/>
           <w:sz w:val="24"/>
         </w:rPr>
-        <w:t>9.1.2  A 类设备使用记录按第6.2.3.3款填写，使用公司现有使用记录，本规程不另建表单。</w:t>
+        <w:t>9.1.2  A 类设备使用记录按第6.2.3.1款填写，使用公司现有使用记录，本规程不另建表单。</w:t>
       </w:r>
     </w:p>
     <w:p>

</xml_diff>